<commit_message>
Updated Vendor FRTC Questionnaire to v1.3.0, archived prev version
</commit_message>
<xml_diff>
--- a/docs/vendor-frtc-questions.docx
+++ b/docs/vendor-frtc-questions.docx
@@ -54,35 +54,21 @@
         <w:rPr>
           <w:rFonts w:ascii="Times New Roman" w:hAnsi="Times New Roman" w:cs="Times New Roman"/>
         </w:rPr>
-        <w:t>What smart card readers does the solution support for</w:t>
-      </w:r>
-      <w:r>
-        <w:rPr>
-          <w:rFonts w:ascii="Times New Roman" w:hAnsi="Times New Roman" w:cs="Times New Roman"/>
-        </w:rPr>
-        <w:t xml:space="preserve"> the </w:t>
-      </w:r>
-      <w:r>
-        <w:rPr>
-          <w:rFonts w:ascii="Times New Roman" w:hAnsi="Times New Roman" w:cs="Times New Roman"/>
-          <w:i/>
-          <w:iCs/>
-        </w:rPr>
-        <w:t xml:space="preserve">time of </w:t>
-      </w:r>
-      <w:r>
-        <w:rPr>
-          <w:rFonts w:ascii="Times New Roman" w:hAnsi="Times New Roman" w:cs="Times New Roman"/>
-          <w:i/>
-          <w:iCs/>
-        </w:rPr>
-        <w:t>registration</w:t>
-      </w:r>
-      <w:r>
-        <w:rPr>
-          <w:rFonts w:ascii="Times New Roman" w:hAnsi="Times New Roman" w:cs="Times New Roman"/>
-        </w:rPr>
-        <w:t>?</w:t>
+        <w:t xml:space="preserve">What is the process for verifying the equipment table, specifically </w:t>
+      </w:r>
+      <w:r>
+        <w:rPr>
+          <w:rFonts w:ascii="Times New Roman" w:hAnsi="Times New Roman" w:cs="Times New Roman"/>
+          <w:kern w:val="0"/>
+          <w14:ligatures w14:val="none"/>
+        </w:rPr>
+        <w:t>the software (SW) and firmware (FW)</w:t>
+      </w:r>
+      <w:r>
+        <w:rPr>
+          <w:rFonts w:ascii="Times New Roman" w:hAnsi="Times New Roman" w:cs="Times New Roman"/>
+        </w:rPr>
+        <w:t xml:space="preserve"> versions?</w:t>
       </w:r>
     </w:p>
     <w:p>
@@ -100,41 +86,79 @@
         <w:rPr>
           <w:rFonts w:ascii="Times New Roman" w:hAnsi="Times New Roman" w:cs="Times New Roman"/>
         </w:rPr>
-        <w:t>What biometric readers doe</w:t>
-      </w:r>
-      <w:r>
-        <w:rPr>
-          <w:rFonts w:ascii="Times New Roman" w:hAnsi="Times New Roman" w:cs="Times New Roman"/>
-        </w:rPr>
-        <w:t>s</w:t>
-      </w:r>
-      <w:r>
-        <w:rPr>
-          <w:rFonts w:ascii="Times New Roman" w:hAnsi="Times New Roman" w:cs="Times New Roman"/>
-        </w:rPr>
-        <w:t xml:space="preserve"> the solution support for </w:t>
-      </w:r>
-      <w:r>
-        <w:rPr>
-          <w:rFonts w:ascii="Times New Roman" w:hAnsi="Times New Roman" w:cs="Times New Roman"/>
-        </w:rPr>
-        <w:t xml:space="preserve">the </w:t>
-      </w:r>
-      <w:r>
-        <w:rPr>
-          <w:rFonts w:ascii="Times New Roman" w:hAnsi="Times New Roman" w:cs="Times New Roman"/>
-          <w:i/>
-          <w:iCs/>
-        </w:rPr>
-        <w:t xml:space="preserve">time of </w:t>
-      </w:r>
-      <w:r>
-        <w:rPr>
-          <w:rFonts w:ascii="Times New Roman" w:hAnsi="Times New Roman" w:cs="Times New Roman"/>
-          <w:i/>
-          <w:iCs/>
-        </w:rPr>
-        <w:t>registration</w:t>
+        <w:t>Does the solution support SM-Auth</w:t>
+      </w:r>
+      <w:r>
+        <w:rPr>
+          <w:rFonts w:ascii="Times New Roman" w:hAnsi="Times New Roman" w:cs="Times New Roman"/>
+        </w:rPr>
+        <w:t xml:space="preserve"> at the </w:t>
+      </w:r>
+      <w:r>
+        <w:rPr>
+          <w:rFonts w:ascii="Times New Roman" w:hAnsi="Times New Roman" w:cs="Times New Roman"/>
+          <w:i/>
+          <w:iCs/>
+        </w:rPr>
+        <w:t>time of registration</w:t>
+      </w:r>
+      <w:r>
+        <w:rPr>
+          <w:rFonts w:ascii="Times New Roman" w:hAnsi="Times New Roman" w:cs="Times New Roman"/>
+        </w:rPr>
+        <w:t>?</w:t>
+      </w:r>
+    </w:p>
+    <w:p>
+      <w:pPr>
+        <w:pStyle w:val="ListParagraph"/>
+        <w:numPr>
+          <w:ilvl w:val="1"/>
+          <w:numId w:val="1"/>
+        </w:numPr>
+        <w:rPr>
+          <w:rFonts w:ascii="Times New Roman" w:hAnsi="Times New Roman" w:cs="Times New Roman"/>
+        </w:rPr>
+      </w:pPr>
+      <w:r>
+        <w:rPr>
+          <w:rFonts w:ascii="Times New Roman" w:hAnsi="Times New Roman" w:cs="Times New Roman"/>
+        </w:rPr>
+        <w:t xml:space="preserve">If yes, how </w:t>
+      </w:r>
+      <w:r>
+        <w:rPr>
+          <w:rFonts w:ascii="Times New Roman" w:hAnsi="Times New Roman" w:cs="Times New Roman"/>
+          <w:kern w:val="0"/>
+          <w14:ligatures w14:val="none"/>
+        </w:rPr>
+        <w:t xml:space="preserve">can I verify that the system collected the pairing code </w:t>
+      </w:r>
+      <w:r>
+        <w:rPr>
+          <w:rFonts w:ascii="Times New Roman" w:hAnsi="Times New Roman" w:cs="Times New Roman"/>
+          <w:kern w:val="0"/>
+          <w14:ligatures w14:val="none"/>
+        </w:rPr>
+        <w:t>during</w:t>
+      </w:r>
+      <w:r>
+        <w:rPr>
+          <w:rFonts w:ascii="Times New Roman" w:hAnsi="Times New Roman" w:cs="Times New Roman"/>
+          <w:i/>
+          <w:iCs/>
+          <w:kern w:val="0"/>
+          <w14:ligatures w14:val="none"/>
+        </w:rPr>
+        <w:t xml:space="preserve"> the time of</w:t>
+      </w:r>
+      <w:r>
+        <w:rPr>
+          <w:rFonts w:ascii="Times New Roman" w:hAnsi="Times New Roman" w:cs="Times New Roman"/>
+          <w:i/>
+          <w:iCs/>
+        </w:rPr>
+        <w:t xml:space="preserve"> registration</w:t>
       </w:r>
       <w:r>
         <w:rPr>
@@ -158,43 +182,41 @@
         <w:rPr>
           <w:rFonts w:ascii="Times New Roman" w:hAnsi="Times New Roman" w:cs="Times New Roman"/>
         </w:rPr>
-        <w:t>Does the product u</w:t>
-      </w:r>
-      <w:r>
-        <w:rPr>
-          <w:rFonts w:ascii="Times New Roman" w:hAnsi="Times New Roman" w:cs="Times New Roman"/>
-        </w:rPr>
-        <w:t>tiliz</w:t>
-      </w:r>
-      <w:r>
-        <w:rPr>
-          <w:rFonts w:ascii="Times New Roman" w:hAnsi="Times New Roman" w:cs="Times New Roman"/>
-        </w:rPr>
-        <w:t xml:space="preserve">e Microsoft Windows CAPI or </w:t>
-      </w:r>
-      <w:r>
-        <w:rPr>
-          <w:rFonts w:ascii="Times New Roman" w:hAnsi="Times New Roman" w:cs="Times New Roman"/>
-        </w:rPr>
-        <w:t>an</w:t>
-      </w:r>
-      <w:r>
-        <w:rPr>
-          <w:rFonts w:ascii="Times New Roman" w:hAnsi="Times New Roman" w:cs="Times New Roman"/>
-        </w:rPr>
-        <w:t xml:space="preserve"> </w:t>
-      </w:r>
-      <w:r>
-        <w:rPr>
-          <w:rFonts w:ascii="Times New Roman" w:hAnsi="Times New Roman" w:cs="Times New Roman"/>
-        </w:rPr>
-        <w:t>alternativ</w:t>
-      </w:r>
-      <w:r>
-        <w:rPr>
-          <w:rFonts w:ascii="Times New Roman" w:hAnsi="Times New Roman" w:cs="Times New Roman"/>
-        </w:rPr>
-        <w:t>e?</w:t>
+        <w:t xml:space="preserve">What smart card readers does the solution support </w:t>
+      </w:r>
+      <w:r>
+        <w:rPr>
+          <w:rFonts w:ascii="Times New Roman" w:hAnsi="Times New Roman" w:cs="Times New Roman"/>
+        </w:rPr>
+        <w:t>at</w:t>
+      </w:r>
+      <w:r>
+        <w:rPr>
+          <w:rFonts w:ascii="Times New Roman" w:hAnsi="Times New Roman" w:cs="Times New Roman"/>
+        </w:rPr>
+        <w:t xml:space="preserve"> the </w:t>
+      </w:r>
+      <w:r>
+        <w:rPr>
+          <w:rFonts w:ascii="Times New Roman" w:hAnsi="Times New Roman" w:cs="Times New Roman"/>
+          <w:i/>
+          <w:iCs/>
+        </w:rPr>
+        <w:t xml:space="preserve">time of </w:t>
+      </w:r>
+      <w:r>
+        <w:rPr>
+          <w:rFonts w:ascii="Times New Roman" w:hAnsi="Times New Roman" w:cs="Times New Roman"/>
+          <w:i/>
+          <w:iCs/>
+        </w:rPr>
+        <w:t>registration</w:t>
+      </w:r>
+      <w:r>
+        <w:rPr>
+          <w:rFonts w:ascii="Times New Roman" w:hAnsi="Times New Roman" w:cs="Times New Roman"/>
+        </w:rPr>
+        <w:t>?</w:t>
       </w:r>
     </w:p>
     <w:p>
@@ -212,51 +234,59 @@
         <w:rPr>
           <w:rFonts w:ascii="Times New Roman" w:hAnsi="Times New Roman" w:cs="Times New Roman"/>
         </w:rPr>
-        <w:t xml:space="preserve">Does it use the </w:t>
-      </w:r>
-      <w:r>
-        <w:rPr>
-          <w:rFonts w:ascii="Times New Roman" w:hAnsi="Times New Roman" w:cs="Times New Roman"/>
-          <w:b/>
-          <w:bCs/>
-          <w:i/>
-          <w:iCs/>
-        </w:rPr>
-        <w:t>Local Machine</w:t>
-      </w:r>
-      <w:r>
-        <w:rPr>
-          <w:rFonts w:ascii="Times New Roman" w:hAnsi="Times New Roman" w:cs="Times New Roman"/>
-        </w:rPr>
-        <w:t xml:space="preserve"> Certificate Store or the </w:t>
-      </w:r>
-      <w:r>
-        <w:rPr>
-          <w:rFonts w:ascii="Times New Roman" w:hAnsi="Times New Roman" w:cs="Times New Roman"/>
-          <w:b/>
-          <w:bCs/>
-          <w:i/>
-          <w:iCs/>
-        </w:rPr>
-        <w:t>Current User</w:t>
-      </w:r>
-      <w:r>
-        <w:rPr>
-          <w:rFonts w:ascii="Times New Roman" w:hAnsi="Times New Roman" w:cs="Times New Roman"/>
-        </w:rPr>
-        <w:t xml:space="preserve"> Certificate </w:t>
-      </w:r>
-      <w:r>
-        <w:rPr>
-          <w:rFonts w:ascii="Times New Roman" w:hAnsi="Times New Roman" w:cs="Times New Roman"/>
-        </w:rPr>
-        <w:t>Store</w:t>
-      </w:r>
-      <w:r>
-        <w:rPr>
-          <w:rFonts w:ascii="Times New Roman" w:hAnsi="Times New Roman" w:cs="Times New Roman"/>
-        </w:rPr>
-        <w:t xml:space="preserve"> if it uses Microsoft CAPI?</w:t>
+        <w:t>What biometric readers doe</w:t>
+      </w:r>
+      <w:r>
+        <w:rPr>
+          <w:rFonts w:ascii="Times New Roman" w:hAnsi="Times New Roman" w:cs="Times New Roman"/>
+        </w:rPr>
+        <w:t>s</w:t>
+      </w:r>
+      <w:r>
+        <w:rPr>
+          <w:rFonts w:ascii="Times New Roman" w:hAnsi="Times New Roman" w:cs="Times New Roman"/>
+        </w:rPr>
+        <w:t xml:space="preserve"> the solution support </w:t>
+      </w:r>
+      <w:r>
+        <w:rPr>
+          <w:rFonts w:ascii="Times New Roman" w:hAnsi="Times New Roman" w:cs="Times New Roman"/>
+        </w:rPr>
+        <w:t>at</w:t>
+      </w:r>
+      <w:r>
+        <w:rPr>
+          <w:rFonts w:ascii="Times New Roman" w:hAnsi="Times New Roman" w:cs="Times New Roman"/>
+        </w:rPr>
+        <w:t xml:space="preserve"> </w:t>
+      </w:r>
+      <w:r>
+        <w:rPr>
+          <w:rFonts w:ascii="Times New Roman" w:hAnsi="Times New Roman" w:cs="Times New Roman"/>
+        </w:rPr>
+        <w:t xml:space="preserve">the </w:t>
+      </w:r>
+      <w:r>
+        <w:rPr>
+          <w:rFonts w:ascii="Times New Roman" w:hAnsi="Times New Roman" w:cs="Times New Roman"/>
+          <w:i/>
+          <w:iCs/>
+        </w:rPr>
+        <w:t xml:space="preserve">time of </w:t>
+      </w:r>
+      <w:r>
+        <w:rPr>
+          <w:rFonts w:ascii="Times New Roman" w:hAnsi="Times New Roman" w:cs="Times New Roman"/>
+          <w:i/>
+          <w:iCs/>
+        </w:rPr>
+        <w:t>registration</w:t>
+      </w:r>
+      <w:r>
+        <w:rPr>
+          <w:rFonts w:ascii="Times New Roman" w:hAnsi="Times New Roman" w:cs="Times New Roman"/>
+        </w:rPr>
+        <w:t>?</w:t>
       </w:r>
     </w:p>
     <w:p>
@@ -274,19 +304,25 @@
         <w:rPr>
           <w:rFonts w:ascii="Times New Roman" w:hAnsi="Times New Roman" w:cs="Times New Roman"/>
         </w:rPr>
-        <w:t>If Microsoft CAPI is not used, w</w:t>
-      </w:r>
-      <w:r>
-        <w:rPr>
-          <w:rFonts w:ascii="Times New Roman" w:hAnsi="Times New Roman" w:cs="Times New Roman"/>
-        </w:rPr>
-        <w:t xml:space="preserve">here </w:t>
-      </w:r>
-      <w:r>
-        <w:rPr>
-          <w:rFonts w:ascii="Times New Roman" w:hAnsi="Times New Roman" w:cs="Times New Roman"/>
-        </w:rPr>
-        <w:t>are the certificates</w:t>
+        <w:t xml:space="preserve">How do you </w:t>
+      </w:r>
+      <w:r>
+        <w:rPr>
+          <w:rFonts w:ascii="Times New Roman" w:hAnsi="Times New Roman" w:cs="Times New Roman"/>
+        </w:rPr>
+        <w:t>enable</w:t>
+      </w:r>
+      <w:r>
+        <w:rPr>
+          <w:rFonts w:ascii="Times New Roman" w:hAnsi="Times New Roman" w:cs="Times New Roman"/>
+        </w:rPr>
+        <w:t xml:space="preserve"> fingerprint verification </w:t>
+      </w:r>
+      <w:r>
+        <w:rPr>
+          <w:rFonts w:ascii="Times New Roman" w:hAnsi="Times New Roman" w:cs="Times New Roman"/>
+        </w:rPr>
+        <w:t>at</w:t>
       </w:r>
       <w:r>
         <w:rPr>
@@ -298,19 +334,15 @@
         <w:rPr>
           <w:rFonts w:ascii="Times New Roman" w:hAnsi="Times New Roman" w:cs="Times New Roman"/>
         </w:rPr>
-        <w:t>install</w:t>
-      </w:r>
-      <w:r>
-        <w:rPr>
-          <w:rFonts w:ascii="Times New Roman" w:hAnsi="Times New Roman" w:cs="Times New Roman"/>
-        </w:rPr>
-        <w:t>ed</w:t>
-      </w:r>
-      <w:r>
-        <w:rPr>
-          <w:rFonts w:ascii="Times New Roman" w:hAnsi="Times New Roman" w:cs="Times New Roman"/>
-        </w:rPr>
-        <w:t xml:space="preserve"> for use in the product for FRTC</w:t>
+        <w:t xml:space="preserve">the </w:t>
+      </w:r>
+      <w:r>
+        <w:rPr>
+          <w:rFonts w:ascii="Times New Roman" w:hAnsi="Times New Roman" w:cs="Times New Roman"/>
+          <w:i/>
+          <w:iCs/>
+        </w:rPr>
+        <w:t>time of registration</w:t>
       </w:r>
       <w:r>
         <w:rPr>
@@ -334,19 +366,51 @@
         <w:rPr>
           <w:rFonts w:ascii="Times New Roman" w:hAnsi="Times New Roman" w:cs="Times New Roman"/>
         </w:rPr>
-        <w:t>Where are the OIDs registered</w:t>
-      </w:r>
-      <w:r>
-        <w:rPr>
-          <w:rFonts w:ascii="Times New Roman" w:hAnsi="Times New Roman" w:cs="Times New Roman"/>
-        </w:rPr>
-        <w:t xml:space="preserve"> or </w:t>
-      </w:r>
-      <w:r>
-        <w:rPr>
-          <w:rFonts w:ascii="Times New Roman" w:hAnsi="Times New Roman" w:cs="Times New Roman"/>
-        </w:rPr>
-        <w:t>changed within the product?</w:t>
+        <w:t xml:space="preserve">How do you </w:t>
+      </w:r>
+      <w:r>
+        <w:rPr>
+          <w:rFonts w:ascii="Times New Roman" w:hAnsi="Times New Roman" w:cs="Times New Roman"/>
+        </w:rPr>
+        <w:t>disable</w:t>
+      </w:r>
+      <w:r>
+        <w:rPr>
+          <w:rFonts w:ascii="Times New Roman" w:hAnsi="Times New Roman" w:cs="Times New Roman"/>
+        </w:rPr>
+        <w:t xml:space="preserve"> fingerprint verification </w:t>
+      </w:r>
+      <w:r>
+        <w:rPr>
+          <w:rFonts w:ascii="Times New Roman" w:hAnsi="Times New Roman" w:cs="Times New Roman"/>
+        </w:rPr>
+        <w:t>at</w:t>
+      </w:r>
+      <w:r>
+        <w:rPr>
+          <w:rFonts w:ascii="Times New Roman" w:hAnsi="Times New Roman" w:cs="Times New Roman"/>
+        </w:rPr>
+        <w:t xml:space="preserve"> </w:t>
+      </w:r>
+      <w:r>
+        <w:rPr>
+          <w:rFonts w:ascii="Times New Roman" w:hAnsi="Times New Roman" w:cs="Times New Roman"/>
+        </w:rPr>
+        <w:t xml:space="preserve">the </w:t>
+      </w:r>
+      <w:r>
+        <w:rPr>
+          <w:rFonts w:ascii="Times New Roman" w:hAnsi="Times New Roman" w:cs="Times New Roman"/>
+          <w:i/>
+          <w:iCs/>
+        </w:rPr>
+        <w:t>time of registration</w:t>
+      </w:r>
+      <w:r>
+        <w:rPr>
+          <w:rFonts w:ascii="Times New Roman" w:hAnsi="Times New Roman" w:cs="Times New Roman"/>
+        </w:rPr>
+        <w:t>?</w:t>
       </w:r>
     </w:p>
     <w:p>
@@ -364,29 +428,45 @@
         <w:rPr>
           <w:rFonts w:ascii="Times New Roman" w:hAnsi="Times New Roman" w:cs="Times New Roman"/>
         </w:rPr>
-        <w:t xml:space="preserve">Where are the logs that show the </w:t>
-      </w:r>
-      <w:r>
-        <w:rPr>
-          <w:rFonts w:ascii="Times New Roman" w:hAnsi="Times New Roman" w:cs="Times New Roman"/>
-          <w:i/>
-          <w:iCs/>
-        </w:rPr>
-        <w:t xml:space="preserve">time of </w:t>
-      </w:r>
-      <w:r>
-        <w:rPr>
-          <w:rFonts w:ascii="Times New Roman" w:hAnsi="Times New Roman" w:cs="Times New Roman"/>
-          <w:i/>
-          <w:iCs/>
-        </w:rPr>
-        <w:t>registration</w:t>
-      </w:r>
-      <w:r>
-        <w:rPr>
-          <w:rFonts w:ascii="Times New Roman" w:hAnsi="Times New Roman" w:cs="Times New Roman"/>
-        </w:rPr>
-        <w:t xml:space="preserve"> outcome</w:t>
+        <w:t>What objects</w:t>
+      </w:r>
+      <w:r>
+        <w:rPr>
+          <w:rFonts w:ascii="Times New Roman" w:hAnsi="Times New Roman" w:cs="Times New Roman"/>
+        </w:rPr>
+        <w:t xml:space="preserve">, attributes, and </w:t>
+      </w:r>
+      <w:r>
+        <w:rPr>
+          <w:rFonts w:ascii="Times New Roman" w:hAnsi="Times New Roman" w:cs="Times New Roman"/>
+        </w:rPr>
+        <w:t>values are read</w:t>
+      </w:r>
+      <w:r>
+        <w:rPr>
+          <w:rFonts w:ascii="Times New Roman" w:hAnsi="Times New Roman" w:cs="Times New Roman"/>
+        </w:rPr>
+        <w:t xml:space="preserve"> and stored in the PACS Software database</w:t>
+      </w:r>
+      <w:r>
+        <w:rPr>
+          <w:rFonts w:ascii="Times New Roman" w:hAnsi="Times New Roman" w:cs="Times New Roman"/>
+        </w:rPr>
+        <w:t xml:space="preserve"> from the PIV Card at </w:t>
+      </w:r>
+      <w:r>
+        <w:rPr>
+          <w:rFonts w:ascii="Times New Roman" w:hAnsi="Times New Roman" w:cs="Times New Roman"/>
+        </w:rPr>
+        <w:t xml:space="preserve">the </w:t>
+      </w:r>
+      <w:r>
+        <w:rPr>
+          <w:rFonts w:ascii="Times New Roman" w:hAnsi="Times New Roman" w:cs="Times New Roman"/>
+          <w:i/>
+          <w:iCs/>
+        </w:rPr>
+        <w:t>time of registration</w:t>
       </w:r>
       <w:r>
         <w:rPr>
@@ -410,21 +490,27 @@
         <w:rPr>
           <w:rFonts w:ascii="Times New Roman" w:hAnsi="Times New Roman" w:cs="Times New Roman"/>
         </w:rPr>
-        <w:t xml:space="preserve">Where are the logs that show the </w:t>
-      </w:r>
-      <w:r>
-        <w:rPr>
-          <w:rFonts w:ascii="Times New Roman" w:hAnsi="Times New Roman" w:cs="Times New Roman"/>
-          <w:i/>
-          <w:iCs/>
-        </w:rPr>
-        <w:t>time of access</w:t>
-      </w:r>
-      <w:r>
-        <w:rPr>
-          <w:rFonts w:ascii="Times New Roman" w:hAnsi="Times New Roman" w:cs="Times New Roman"/>
-        </w:rPr>
-        <w:t xml:space="preserve"> outcome</w:t>
+        <w:t>How do I determine what the PACS system uses as the primary identifier</w:t>
+      </w:r>
+      <w:r>
+        <w:rPr>
+          <w:rFonts w:ascii="Times New Roman" w:hAnsi="Times New Roman" w:cs="Times New Roman"/>
+        </w:rPr>
+        <w:t xml:space="preserve"> at the</w:t>
+      </w:r>
+      <w:r>
+        <w:rPr>
+          <w:rFonts w:ascii="Times New Roman" w:hAnsi="Times New Roman" w:cs="Times New Roman"/>
+        </w:rPr>
+        <w:t xml:space="preserve"> </w:t>
+      </w:r>
+      <w:r>
+        <w:rPr>
+          <w:rFonts w:ascii="Times New Roman" w:hAnsi="Times New Roman" w:cs="Times New Roman"/>
+          <w:i/>
+          <w:iCs/>
+        </w:rPr>
+        <w:t>Time of Registration</w:t>
       </w:r>
       <w:r>
         <w:rPr>
@@ -448,25 +534,31 @@
         <w:rPr>
           <w:rFonts w:ascii="Times New Roman" w:hAnsi="Times New Roman" w:cs="Times New Roman"/>
         </w:rPr>
-        <w:t xml:space="preserve">How </w:t>
-      </w:r>
-      <w:r>
-        <w:rPr>
-          <w:rFonts w:ascii="Times New Roman" w:hAnsi="Times New Roman" w:cs="Times New Roman"/>
-        </w:rPr>
-        <w:t xml:space="preserve">do you </w:t>
-      </w:r>
-      <w:r>
-        <w:rPr>
-          <w:rFonts w:ascii="Times New Roman" w:hAnsi="Times New Roman" w:cs="Times New Roman"/>
-        </w:rPr>
-        <w:t>turn off</w:t>
-      </w:r>
-      <w:r>
-        <w:rPr>
-          <w:rFonts w:ascii="Times New Roman" w:hAnsi="Times New Roman" w:cs="Times New Roman"/>
-        </w:rPr>
-        <w:t xml:space="preserve"> certificate validation for </w:t>
+        <w:t>Where are the OIDs registered</w:t>
+      </w:r>
+      <w:r>
+        <w:rPr>
+          <w:rFonts w:ascii="Times New Roman" w:hAnsi="Times New Roman" w:cs="Times New Roman"/>
+        </w:rPr>
+        <w:t xml:space="preserve"> or </w:t>
+      </w:r>
+      <w:r>
+        <w:rPr>
+          <w:rFonts w:ascii="Times New Roman" w:hAnsi="Times New Roman" w:cs="Times New Roman"/>
+        </w:rPr>
+        <w:t>changed within the product</w:t>
+      </w:r>
+      <w:r>
+        <w:rPr>
+          <w:rFonts w:ascii="Times New Roman" w:hAnsi="Times New Roman" w:cs="Times New Roman"/>
+        </w:rPr>
+        <w:t xml:space="preserve"> </w:t>
+      </w:r>
+      <w:r>
+        <w:rPr>
+          <w:rFonts w:ascii="Times New Roman" w:hAnsi="Times New Roman" w:cs="Times New Roman"/>
+        </w:rPr>
+        <w:t xml:space="preserve">at </w:t>
       </w:r>
       <w:r>
         <w:rPr>
@@ -480,15 +572,7 @@
           <w:i/>
           <w:iCs/>
         </w:rPr>
-        <w:t xml:space="preserve">time of </w:t>
-      </w:r>
-      <w:r>
-        <w:rPr>
-          <w:rFonts w:ascii="Times New Roman" w:hAnsi="Times New Roman" w:cs="Times New Roman"/>
-          <w:i/>
-          <w:iCs/>
-        </w:rPr>
-        <w:t>registration</w:t>
+        <w:t>time of registration</w:t>
       </w:r>
       <w:r>
         <w:rPr>
@@ -512,65 +596,21 @@
         <w:rPr>
           <w:rFonts w:ascii="Times New Roman" w:hAnsi="Times New Roman" w:cs="Times New Roman"/>
         </w:rPr>
-        <w:t xml:space="preserve">How </w:t>
-      </w:r>
-      <w:r>
-        <w:rPr>
-          <w:rFonts w:ascii="Times New Roman" w:hAnsi="Times New Roman" w:cs="Times New Roman"/>
-        </w:rPr>
-        <w:t xml:space="preserve">do you </w:t>
-      </w:r>
-      <w:r>
-        <w:rPr>
-          <w:rFonts w:ascii="Times New Roman" w:hAnsi="Times New Roman" w:cs="Times New Roman"/>
-        </w:rPr>
-        <w:t>turn off</w:t>
-      </w:r>
-      <w:r>
-        <w:rPr>
-          <w:rFonts w:ascii="Times New Roman" w:hAnsi="Times New Roman" w:cs="Times New Roman"/>
-        </w:rPr>
-        <w:t xml:space="preserve"> certificate validation for the </w:t>
-      </w:r>
-      <w:r>
-        <w:rPr>
-          <w:rFonts w:ascii="Times New Roman" w:hAnsi="Times New Roman" w:cs="Times New Roman"/>
-        </w:rPr>
-        <w:t>duration</w:t>
-      </w:r>
-      <w:r>
-        <w:rPr>
-          <w:rFonts w:ascii="Times New Roman" w:hAnsi="Times New Roman" w:cs="Times New Roman"/>
-        </w:rPr>
-        <w:t xml:space="preserve"> of </w:t>
-      </w:r>
-      <w:r>
-        <w:rPr>
-          <w:rFonts w:ascii="Times New Roman" w:hAnsi="Times New Roman" w:cs="Times New Roman"/>
-        </w:rPr>
-        <w:t xml:space="preserve">the </w:t>
-      </w:r>
-      <w:r>
-        <w:rPr>
-          <w:rFonts w:ascii="Times New Roman" w:hAnsi="Times New Roman" w:cs="Times New Roman"/>
-          <w:i/>
-          <w:iCs/>
-        </w:rPr>
-        <w:t xml:space="preserve">time of </w:t>
-      </w:r>
-      <w:r>
-        <w:rPr>
-          <w:rFonts w:ascii="Times New Roman" w:hAnsi="Times New Roman" w:cs="Times New Roman"/>
-          <w:i/>
-          <w:iCs/>
-        </w:rPr>
-        <w:t>access</w:t>
-      </w:r>
-      <w:r>
-        <w:rPr>
-          <w:rFonts w:ascii="Times New Roman" w:hAnsi="Times New Roman" w:cs="Times New Roman"/>
-        </w:rPr>
-        <w:t>?</w:t>
+        <w:t xml:space="preserve">Where are the logs that show the </w:t>
+      </w:r>
+      <w:r>
+        <w:rPr>
+          <w:rFonts w:ascii="Times New Roman" w:hAnsi="Times New Roman" w:cs="Times New Roman"/>
+          <w:i/>
+          <w:iCs/>
+        </w:rPr>
+        <w:t>time of registration</w:t>
+      </w:r>
+      <w:r>
+        <w:rPr>
+          <w:rFonts w:ascii="Times New Roman" w:hAnsi="Times New Roman" w:cs="Times New Roman"/>
+        </w:rPr>
+        <w:t xml:space="preserve"> outcome?</w:t>
       </w:r>
     </w:p>
     <w:p>
@@ -588,37 +628,25 @@
         <w:rPr>
           <w:rFonts w:ascii="Times New Roman" w:hAnsi="Times New Roman" w:cs="Times New Roman"/>
         </w:rPr>
-        <w:t xml:space="preserve">Does your solution rely on a validation process within the PACS software to </w:t>
-      </w:r>
-      <w:r>
-        <w:rPr>
-          <w:rFonts w:ascii="Times New Roman" w:hAnsi="Times New Roman" w:cs="Times New Roman"/>
-        </w:rPr>
-        <w:t>updat</w:t>
-      </w:r>
-      <w:r>
-        <w:rPr>
-          <w:rFonts w:ascii="Times New Roman" w:hAnsi="Times New Roman" w:cs="Times New Roman"/>
-        </w:rPr>
-        <w:t xml:space="preserve">e the user status </w:t>
-      </w:r>
-      <w:r>
-        <w:rPr>
-          <w:rFonts w:ascii="Times New Roman" w:hAnsi="Times New Roman" w:cs="Times New Roman"/>
-        </w:rPr>
-        <w:t>during</w:t>
-      </w:r>
-      <w:r>
-        <w:rPr>
-          <w:rFonts w:ascii="Times New Roman" w:hAnsi="Times New Roman" w:cs="Times New Roman"/>
-        </w:rPr>
-        <w:t xml:space="preserve"> access test cases</w:t>
-      </w:r>
-      <w:r>
-        <w:rPr>
-          <w:rFonts w:ascii="Times New Roman" w:hAnsi="Times New Roman" w:cs="Times New Roman"/>
-        </w:rPr>
-        <w:t>,</w:t>
+        <w:t>Does the product u</w:t>
+      </w:r>
+      <w:r>
+        <w:rPr>
+          <w:rFonts w:ascii="Times New Roman" w:hAnsi="Times New Roman" w:cs="Times New Roman"/>
+        </w:rPr>
+        <w:t>tiliz</w:t>
+      </w:r>
+      <w:r>
+        <w:rPr>
+          <w:rFonts w:ascii="Times New Roman" w:hAnsi="Times New Roman" w:cs="Times New Roman"/>
+        </w:rPr>
+        <w:t xml:space="preserve">e Microsoft Windows CAPI or </w:t>
+      </w:r>
+      <w:r>
+        <w:rPr>
+          <w:rFonts w:ascii="Times New Roman" w:hAnsi="Times New Roman" w:cs="Times New Roman"/>
+        </w:rPr>
+        <w:t>an</w:t>
       </w:r>
       <w:r>
         <w:rPr>
@@ -630,19 +658,141 @@
         <w:rPr>
           <w:rFonts w:ascii="Times New Roman" w:hAnsi="Times New Roman" w:cs="Times New Roman"/>
         </w:rPr>
-        <w:t>ensuring</w:t>
-      </w:r>
-      <w:r>
-        <w:rPr>
-          <w:rFonts w:ascii="Times New Roman" w:hAnsi="Times New Roman" w:cs="Times New Roman"/>
-        </w:rPr>
-        <w:t xml:space="preserve"> they </w:t>
-      </w:r>
-      <w:r>
-        <w:rPr>
-          <w:rFonts w:ascii="Times New Roman" w:hAnsi="Times New Roman" w:cs="Times New Roman"/>
-        </w:rPr>
-        <w:t>respond as expected?</w:t>
+        <w:t>alternativ</w:t>
+      </w:r>
+      <w:r>
+        <w:rPr>
+          <w:rFonts w:ascii="Times New Roman" w:hAnsi="Times New Roman" w:cs="Times New Roman"/>
+        </w:rPr>
+        <w:t>e?</w:t>
+      </w:r>
+    </w:p>
+    <w:p>
+      <w:pPr>
+        <w:pStyle w:val="ListParagraph"/>
+        <w:numPr>
+          <w:ilvl w:val="1"/>
+          <w:numId w:val="1"/>
+        </w:numPr>
+        <w:rPr>
+          <w:rFonts w:ascii="Times New Roman" w:hAnsi="Times New Roman" w:cs="Times New Roman"/>
+        </w:rPr>
+      </w:pPr>
+      <w:r>
+        <w:rPr>
+          <w:rFonts w:ascii="Times New Roman" w:hAnsi="Times New Roman" w:cs="Times New Roman"/>
+        </w:rPr>
+        <w:t xml:space="preserve">Does Microsoft Windows CAPI </w:t>
+      </w:r>
+      <w:r>
+        <w:rPr>
+          <w:rFonts w:ascii="Times New Roman" w:hAnsi="Times New Roman" w:cs="Times New Roman"/>
+        </w:rPr>
+        <w:t xml:space="preserve">use the </w:t>
+      </w:r>
+      <w:r>
+        <w:rPr>
+          <w:rFonts w:ascii="Times New Roman" w:hAnsi="Times New Roman" w:cs="Times New Roman"/>
+          <w:b/>
+          <w:bCs/>
+          <w:i/>
+          <w:iCs/>
+        </w:rPr>
+        <w:t>Local Machine</w:t>
+      </w:r>
+      <w:r>
+        <w:rPr>
+          <w:rFonts w:ascii="Times New Roman" w:hAnsi="Times New Roman" w:cs="Times New Roman"/>
+        </w:rPr>
+        <w:t xml:space="preserve"> Certificate Store or the </w:t>
+      </w:r>
+      <w:r>
+        <w:rPr>
+          <w:rFonts w:ascii="Times New Roman" w:hAnsi="Times New Roman" w:cs="Times New Roman"/>
+          <w:b/>
+          <w:bCs/>
+          <w:i/>
+          <w:iCs/>
+        </w:rPr>
+        <w:t>Current User</w:t>
+      </w:r>
+      <w:r>
+        <w:rPr>
+          <w:rFonts w:ascii="Times New Roman" w:hAnsi="Times New Roman" w:cs="Times New Roman"/>
+        </w:rPr>
+        <w:t xml:space="preserve"> Certificate </w:t>
+      </w:r>
+      <w:r>
+        <w:rPr>
+          <w:rFonts w:ascii="Times New Roman" w:hAnsi="Times New Roman" w:cs="Times New Roman"/>
+        </w:rPr>
+        <w:t>Store</w:t>
+      </w:r>
+      <w:r>
+        <w:rPr>
+          <w:rFonts w:ascii="Times New Roman" w:hAnsi="Times New Roman" w:cs="Times New Roman"/>
+        </w:rPr>
+        <w:t>?</w:t>
+      </w:r>
+    </w:p>
+    <w:p>
+      <w:pPr>
+        <w:pStyle w:val="ListParagraph"/>
+        <w:numPr>
+          <w:ilvl w:val="1"/>
+          <w:numId w:val="1"/>
+        </w:numPr>
+        <w:rPr>
+          <w:rFonts w:ascii="Times New Roman" w:hAnsi="Times New Roman" w:cs="Times New Roman"/>
+        </w:rPr>
+      </w:pPr>
+      <w:r>
+        <w:rPr>
+          <w:rFonts w:ascii="Times New Roman" w:hAnsi="Times New Roman" w:cs="Times New Roman"/>
+        </w:rPr>
+        <w:t>If Microsoft CAPI is not used, w</w:t>
+      </w:r>
+      <w:r>
+        <w:rPr>
+          <w:rFonts w:ascii="Times New Roman" w:hAnsi="Times New Roman" w:cs="Times New Roman"/>
+        </w:rPr>
+        <w:t xml:space="preserve">here </w:t>
+      </w:r>
+      <w:r>
+        <w:rPr>
+          <w:rFonts w:ascii="Times New Roman" w:hAnsi="Times New Roman" w:cs="Times New Roman"/>
+        </w:rPr>
+        <w:t>are the certificates</w:t>
+      </w:r>
+      <w:r>
+        <w:rPr>
+          <w:rFonts w:ascii="Times New Roman" w:hAnsi="Times New Roman" w:cs="Times New Roman"/>
+        </w:rPr>
+        <w:t xml:space="preserve"> </w:t>
+      </w:r>
+      <w:r>
+        <w:rPr>
+          <w:rFonts w:ascii="Times New Roman" w:hAnsi="Times New Roman" w:cs="Times New Roman"/>
+        </w:rPr>
+        <w:t>install</w:t>
+      </w:r>
+      <w:r>
+        <w:rPr>
+          <w:rFonts w:ascii="Times New Roman" w:hAnsi="Times New Roman" w:cs="Times New Roman"/>
+        </w:rPr>
+        <w:t>ed</w:t>
+      </w:r>
+      <w:r>
+        <w:rPr>
+          <w:rFonts w:ascii="Times New Roman" w:hAnsi="Times New Roman" w:cs="Times New Roman"/>
+        </w:rPr>
+        <w:t xml:space="preserve"> for use in the product for FRTC</w:t>
+      </w:r>
+      <w:r>
+        <w:rPr>
+          <w:rFonts w:ascii="Times New Roman" w:hAnsi="Times New Roman" w:cs="Times New Roman"/>
+        </w:rPr>
+        <w:t>?</w:t>
       </w:r>
     </w:p>
     <w:p>
@@ -660,27 +810,33 @@
         <w:rPr>
           <w:rFonts w:ascii="Times New Roman" w:hAnsi="Times New Roman" w:cs="Times New Roman"/>
         </w:rPr>
-        <w:t>What is the process for verifying the equipment table</w:t>
-      </w:r>
-      <w:r>
-        <w:rPr>
-          <w:rFonts w:ascii="Times New Roman" w:hAnsi="Times New Roman" w:cs="Times New Roman"/>
-        </w:rPr>
-        <w:t xml:space="preserve">, specifically </w:t>
-      </w:r>
-      <w:r>
-        <w:rPr>
-          <w:rFonts w:ascii="Times New Roman" w:hAnsi="Times New Roman" w:cs="Times New Roman"/>
-          <w:kern w:val="0"/>
-          <w14:ligatures w14:val="none"/>
-        </w:rPr>
-        <w:t>the software (SW) and firmware (FW)</w:t>
-      </w:r>
-      <w:r>
-        <w:rPr>
-          <w:rFonts w:ascii="Times New Roman" w:hAnsi="Times New Roman" w:cs="Times New Roman"/>
-        </w:rPr>
-        <w:t xml:space="preserve"> versions</w:t>
+        <w:t xml:space="preserve">How do you </w:t>
+      </w:r>
+      <w:r>
+        <w:rPr>
+          <w:rFonts w:ascii="Times New Roman" w:hAnsi="Times New Roman" w:cs="Times New Roman"/>
+        </w:rPr>
+        <w:t>disable</w:t>
+      </w:r>
+      <w:r>
+        <w:rPr>
+          <w:rFonts w:ascii="Times New Roman" w:hAnsi="Times New Roman" w:cs="Times New Roman"/>
+        </w:rPr>
+        <w:t xml:space="preserve"> certificate validation for </w:t>
+      </w:r>
+      <w:r>
+        <w:rPr>
+          <w:rFonts w:ascii="Times New Roman" w:hAnsi="Times New Roman" w:cs="Times New Roman"/>
+        </w:rPr>
+        <w:t xml:space="preserve">the </w:t>
+      </w:r>
+      <w:r>
+        <w:rPr>
+          <w:rFonts w:ascii="Times New Roman" w:hAnsi="Times New Roman" w:cs="Times New Roman"/>
+          <w:i/>
+          <w:iCs/>
+        </w:rPr>
+        <w:t>time of registration</w:t>
       </w:r>
       <w:r>
         <w:rPr>
@@ -704,43 +860,65 @@
         <w:rPr>
           <w:rFonts w:ascii="Times New Roman" w:hAnsi="Times New Roman" w:cs="Times New Roman"/>
         </w:rPr>
-        <w:t xml:space="preserve">How </w:t>
-      </w:r>
-      <w:r>
-        <w:rPr>
-          <w:rFonts w:ascii="Times New Roman" w:hAnsi="Times New Roman" w:cs="Times New Roman"/>
-        </w:rPr>
-        <w:t>to</w:t>
-      </w:r>
-      <w:r>
-        <w:rPr>
-          <w:rFonts w:ascii="Times New Roman" w:hAnsi="Times New Roman" w:cs="Times New Roman"/>
-        </w:rPr>
-        <w:t xml:space="preserve"> </w:t>
-      </w:r>
-      <w:r>
-        <w:rPr>
-          <w:rFonts w:ascii="Times New Roman" w:hAnsi="Times New Roman" w:cs="Times New Roman"/>
-        </w:rPr>
-        <w:t>change authentication modes on the reader</w:t>
-      </w:r>
-      <w:r>
-        <w:rPr>
-          <w:rFonts w:ascii="Times New Roman" w:hAnsi="Times New Roman" w:cs="Times New Roman"/>
-        </w:rPr>
-        <w:t xml:space="preserve">(s) </w:t>
-      </w:r>
-      <w:r>
-        <w:rPr>
-          <w:rFonts w:ascii="Times New Roman" w:hAnsi="Times New Roman" w:cs="Times New Roman"/>
-        </w:rPr>
-        <w:t>(PKI-CAK, PKI-AUTH, PKI-CAK+BIO, PKI-AUTH+BIO)</w:t>
-      </w:r>
-      <w:r>
-        <w:rPr>
-          <w:rFonts w:ascii="Times New Roman" w:hAnsi="Times New Roman" w:cs="Times New Roman"/>
-        </w:rPr>
-        <w:t>?</w:t>
+        <w:t xml:space="preserve">The vendor shall </w:t>
+      </w:r>
+      <w:r>
+        <w:rPr>
+          <w:rFonts w:ascii="Times New Roman" w:hAnsi="Times New Roman" w:cs="Times New Roman"/>
+        </w:rPr>
+        <w:t xml:space="preserve">confirm the </w:t>
+      </w:r>
+      <w:r>
+        <w:rPr>
+          <w:rFonts w:ascii="Times New Roman" w:hAnsi="Times New Roman" w:cs="Times New Roman"/>
+        </w:rPr>
+        <w:t xml:space="preserve">item doing the crypto at </w:t>
+      </w:r>
+      <w:r>
+        <w:rPr>
+          <w:rFonts w:ascii="Times New Roman" w:hAnsi="Times New Roman" w:cs="Times New Roman"/>
+        </w:rPr>
+        <w:t xml:space="preserve">the </w:t>
+      </w:r>
+      <w:r>
+        <w:rPr>
+          <w:rFonts w:ascii="Times New Roman" w:hAnsi="Times New Roman" w:cs="Times New Roman"/>
+          <w:i/>
+          <w:iCs/>
+        </w:rPr>
+        <w:t xml:space="preserve">Time of </w:t>
+      </w:r>
+      <w:r>
+        <w:rPr>
+          <w:rFonts w:ascii="Times New Roman" w:hAnsi="Times New Roman" w:cs="Times New Roman"/>
+          <w:i/>
+          <w:iCs/>
+        </w:rPr>
+        <w:t>Registration</w:t>
+      </w:r>
+      <w:r>
+        <w:rPr>
+          <w:rFonts w:ascii="Times New Roman" w:hAnsi="Times New Roman" w:cs="Times New Roman"/>
+        </w:rPr>
+        <w:t xml:space="preserve"> and </w:t>
+      </w:r>
+      <w:r>
+        <w:rPr>
+          <w:rFonts w:ascii="Times New Roman" w:hAnsi="Times New Roman" w:cs="Times New Roman"/>
+        </w:rPr>
+        <w:t xml:space="preserve">provide </w:t>
+      </w:r>
+      <w:r>
+        <w:rPr>
+          <w:rFonts w:ascii="Times New Roman" w:hAnsi="Times New Roman" w:cs="Times New Roman"/>
+        </w:rPr>
+        <w:t xml:space="preserve">the </w:t>
+      </w:r>
+      <w:r>
+        <w:rPr>
+          <w:rFonts w:ascii="Times New Roman" w:hAnsi="Times New Roman" w:cs="Times New Roman"/>
+        </w:rPr>
+        <w:t>CMVP certificate number.</w:t>
       </w:r>
     </w:p>
     <w:p>
@@ -752,40 +930,85 @@
         </w:numPr>
         <w:rPr>
           <w:rFonts w:ascii="Times New Roman" w:hAnsi="Times New Roman" w:cs="Times New Roman"/>
-          <w:i/>
-          <w:iCs/>
-        </w:rPr>
-      </w:pPr>
-      <w:r>
-        <w:rPr>
-          <w:rFonts w:ascii="Times New Roman" w:hAnsi="Times New Roman" w:cs="Times New Roman"/>
-        </w:rPr>
-        <w:t xml:space="preserve">How can the negotiated bit rate on the contact reader be changed to 446 KBps? </w:t>
-      </w:r>
-      <w:r>
-        <w:rPr>
-          <w:rFonts w:ascii="Times New Roman" w:hAnsi="Times New Roman" w:cs="Times New Roman"/>
-          <w:i/>
-          <w:iCs/>
-        </w:rPr>
-        <w:t>(</w:t>
-      </w:r>
-      <w:r>
-        <w:rPr>
-          <w:rFonts w:ascii="Times New Roman" w:hAnsi="Times New Roman" w:cs="Times New Roman"/>
-          <w:i/>
-          <w:iCs/>
-        </w:rPr>
-        <w:t xml:space="preserve">FRTC Test Case </w:t>
-      </w:r>
-      <w:r>
-        <w:rPr>
-          <w:rFonts w:ascii="Times New Roman" w:hAnsi="Times New Roman" w:cs="Times New Roman"/>
-          <w:i/>
-          <w:iCs/>
-        </w:rPr>
-        <w:t>5.18.01)</w:t>
-      </w:r>
+        </w:rPr>
+      </w:pPr>
+      <w:r>
+        <w:rPr>
+          <w:rFonts w:ascii="Times New Roman" w:hAnsi="Times New Roman" w:cs="Times New Roman"/>
+        </w:rPr>
+        <w:t xml:space="preserve">Does the solution </w:t>
+      </w:r>
+      <w:r>
+        <w:rPr>
+          <w:rFonts w:ascii="Times New Roman" w:hAnsi="Times New Roman" w:cs="Times New Roman"/>
+        </w:rPr>
+        <w:t>utilize</w:t>
+      </w:r>
+      <w:r>
+        <w:rPr>
+          <w:rFonts w:ascii="Times New Roman" w:hAnsi="Times New Roman" w:cs="Times New Roman"/>
+        </w:rPr>
+        <w:t xml:space="preserve"> a cached copy of the public key extracted at the </w:t>
+      </w:r>
+      <w:r>
+        <w:rPr>
+          <w:rFonts w:ascii="Times New Roman" w:hAnsi="Times New Roman" w:cs="Times New Roman"/>
+          <w:i/>
+          <w:iCs/>
+        </w:rPr>
+        <w:t>time of registration</w:t>
+      </w:r>
+      <w:r>
+        <w:rPr>
+          <w:rFonts w:ascii="Times New Roman" w:hAnsi="Times New Roman" w:cs="Times New Roman"/>
+        </w:rPr>
+        <w:t xml:space="preserve"> for signature verification at the </w:t>
+      </w:r>
+      <w:r>
+        <w:rPr>
+          <w:rFonts w:ascii="Times New Roman" w:hAnsi="Times New Roman" w:cs="Times New Roman"/>
+          <w:i/>
+          <w:iCs/>
+        </w:rPr>
+        <w:t>t</w:t>
+      </w:r>
+      <w:r>
+        <w:rPr>
+          <w:rFonts w:ascii="Times New Roman" w:hAnsi="Times New Roman" w:cs="Times New Roman"/>
+          <w:i/>
+          <w:iCs/>
+        </w:rPr>
+        <w:t xml:space="preserve">ime of </w:t>
+      </w:r>
+      <w:r>
+        <w:rPr>
+          <w:rFonts w:ascii="Times New Roman" w:hAnsi="Times New Roman" w:cs="Times New Roman"/>
+          <w:i/>
+          <w:iCs/>
+        </w:rPr>
+        <w:t>a</w:t>
+      </w:r>
+      <w:r>
+        <w:rPr>
+          <w:rFonts w:ascii="Times New Roman" w:hAnsi="Times New Roman" w:cs="Times New Roman"/>
+          <w:i/>
+          <w:iCs/>
+        </w:rPr>
+        <w:t>ccess</w:t>
+      </w:r>
+      <w:r>
+        <w:rPr>
+          <w:rFonts w:ascii="Times New Roman" w:hAnsi="Times New Roman" w:cs="Times New Roman"/>
+        </w:rPr>
+        <w:t>? (5.02.06)</w:t>
+      </w:r>
+    </w:p>
+    <w:p>
+      <w:pPr>
+        <w:rPr>
+          <w:rFonts w:ascii="Times New Roman" w:hAnsi="Times New Roman" w:cs="Times New Roman"/>
+        </w:rPr>
+      </w:pPr>
     </w:p>
     <w:p>
       <w:pPr>
@@ -802,31 +1025,33 @@
         <w:rPr>
           <w:rFonts w:ascii="Times New Roman" w:hAnsi="Times New Roman" w:cs="Times New Roman"/>
         </w:rPr>
-        <w:t xml:space="preserve">How can the negotiated bit rate on the contactless reader be changed to 848 KBps? </w:t>
-      </w:r>
-      <w:r>
-        <w:rPr>
-          <w:rFonts w:ascii="Times New Roman" w:hAnsi="Times New Roman" w:cs="Times New Roman"/>
-          <w:i/>
-          <w:iCs/>
-        </w:rPr>
-        <w:t>(</w:t>
-      </w:r>
-      <w:r>
-        <w:rPr>
-          <w:rFonts w:ascii="Times New Roman" w:hAnsi="Times New Roman" w:cs="Times New Roman"/>
-          <w:i/>
-          <w:iCs/>
-        </w:rPr>
-        <w:t xml:space="preserve">FRTC Test Case </w:t>
-      </w:r>
-      <w:r>
-        <w:rPr>
-          <w:rFonts w:ascii="Times New Roman" w:hAnsi="Times New Roman" w:cs="Times New Roman"/>
-          <w:i/>
-          <w:iCs/>
-        </w:rPr>
-        <w:t>5.18.02)</w:t>
+        <w:t>How do I determine what the PACS system uses as the primary identifier</w:t>
+      </w:r>
+      <w:r>
+        <w:rPr>
+          <w:rFonts w:ascii="Times New Roman" w:hAnsi="Times New Roman" w:cs="Times New Roman"/>
+        </w:rPr>
+        <w:t xml:space="preserve"> at the</w:t>
+      </w:r>
+      <w:r>
+        <w:rPr>
+          <w:rFonts w:ascii="Times New Roman" w:hAnsi="Times New Roman" w:cs="Times New Roman"/>
+        </w:rPr>
+        <w:t xml:space="preserve"> </w:t>
+      </w:r>
+      <w:r>
+        <w:rPr>
+          <w:rFonts w:ascii="Times New Roman" w:hAnsi="Times New Roman" w:cs="Times New Roman"/>
+          <w:i/>
+          <w:iCs/>
+        </w:rPr>
+        <w:t>Time of Access</w:t>
+      </w:r>
+      <w:r>
+        <w:rPr>
+          <w:rFonts w:ascii="Times New Roman" w:hAnsi="Times New Roman" w:cs="Times New Roman"/>
+        </w:rPr>
+        <w:t>?</w:t>
       </w:r>
     </w:p>
     <w:p>
@@ -844,31 +1069,59 @@
         <w:rPr>
           <w:rFonts w:ascii="Times New Roman" w:hAnsi="Times New Roman" w:cs="Times New Roman"/>
         </w:rPr>
-        <w:t xml:space="preserve">How </w:t>
-      </w:r>
-      <w:r>
-        <w:rPr>
-          <w:rFonts w:ascii="Times New Roman" w:hAnsi="Times New Roman" w:cs="Times New Roman"/>
-        </w:rPr>
-        <w:t xml:space="preserve">do you </w:t>
-      </w:r>
-      <w:r>
-        <w:rPr>
-          <w:rFonts w:ascii="Times New Roman" w:hAnsi="Times New Roman" w:cs="Times New Roman"/>
-        </w:rPr>
-        <w:t xml:space="preserve">configure the software application to support </w:t>
-      </w:r>
-      <w:r>
-        <w:rPr>
-          <w:rFonts w:ascii="Times New Roman" w:hAnsi="Times New Roman" w:cs="Times New Roman"/>
-        </w:rPr>
-        <w:t>the use of</w:t>
-      </w:r>
-      <w:r>
-        <w:rPr>
-          <w:rFonts w:ascii="Times New Roman" w:hAnsi="Times New Roman" w:cs="Times New Roman"/>
-        </w:rPr>
-        <w:t xml:space="preserve"> 128-bit FASC-N for Time of Registration and Time of Access?</w:t>
+        <w:t>Where are the OIDs registered</w:t>
+      </w:r>
+      <w:r>
+        <w:rPr>
+          <w:rFonts w:ascii="Times New Roman" w:hAnsi="Times New Roman" w:cs="Times New Roman"/>
+        </w:rPr>
+        <w:t xml:space="preserve"> or </w:t>
+      </w:r>
+      <w:r>
+        <w:rPr>
+          <w:rFonts w:ascii="Times New Roman" w:hAnsi="Times New Roman" w:cs="Times New Roman"/>
+        </w:rPr>
+        <w:t>changed within the product</w:t>
+      </w:r>
+      <w:r>
+        <w:rPr>
+          <w:rFonts w:ascii="Times New Roman" w:hAnsi="Times New Roman" w:cs="Times New Roman"/>
+        </w:rPr>
+        <w:t xml:space="preserve"> </w:t>
+      </w:r>
+      <w:r>
+        <w:rPr>
+          <w:rFonts w:ascii="Times New Roman" w:hAnsi="Times New Roman" w:cs="Times New Roman"/>
+        </w:rPr>
+        <w:t xml:space="preserve">at </w:t>
+      </w:r>
+      <w:r>
+        <w:rPr>
+          <w:rFonts w:ascii="Times New Roman" w:hAnsi="Times New Roman" w:cs="Times New Roman"/>
+        </w:rPr>
+        <w:t xml:space="preserve">the </w:t>
+      </w:r>
+      <w:r>
+        <w:rPr>
+          <w:rFonts w:ascii="Times New Roman" w:hAnsi="Times New Roman" w:cs="Times New Roman"/>
+          <w:i/>
+          <w:iCs/>
+        </w:rPr>
+        <w:t xml:space="preserve">time of </w:t>
+      </w:r>
+      <w:r>
+        <w:rPr>
+          <w:rFonts w:ascii="Times New Roman" w:hAnsi="Times New Roman" w:cs="Times New Roman"/>
+          <w:i/>
+          <w:iCs/>
+        </w:rPr>
+        <w:t>access</w:t>
+      </w:r>
+      <w:r>
+        <w:rPr>
+          <w:rFonts w:ascii="Times New Roman" w:hAnsi="Times New Roman" w:cs="Times New Roman"/>
+        </w:rPr>
+        <w:t>?</w:t>
       </w:r>
     </w:p>
     <w:p>
@@ -886,43 +1139,27 @@
         <w:rPr>
           <w:rFonts w:ascii="Times New Roman" w:hAnsi="Times New Roman" w:cs="Times New Roman"/>
         </w:rPr>
-        <w:t xml:space="preserve">How </w:t>
-      </w:r>
-      <w:r>
-        <w:rPr>
-          <w:rFonts w:ascii="Times New Roman" w:hAnsi="Times New Roman" w:cs="Times New Roman"/>
-        </w:rPr>
-        <w:t xml:space="preserve">do you </w:t>
-      </w:r>
-      <w:r>
-        <w:rPr>
-          <w:rFonts w:ascii="Times New Roman" w:hAnsi="Times New Roman" w:cs="Times New Roman"/>
-        </w:rPr>
-        <w:t xml:space="preserve">configure the software application to support </w:t>
-      </w:r>
-      <w:r>
-        <w:rPr>
-          <w:rFonts w:ascii="Times New Roman" w:hAnsi="Times New Roman" w:cs="Times New Roman"/>
-        </w:rPr>
-        <w:t>the use of</w:t>
-      </w:r>
-      <w:r>
-        <w:rPr>
-          <w:rFonts w:ascii="Times New Roman" w:hAnsi="Times New Roman" w:cs="Times New Roman"/>
-        </w:rPr>
-        <w:t xml:space="preserve"> </w:t>
-      </w:r>
-      <w:r>
-        <w:rPr>
-          <w:rFonts w:ascii="Times New Roman" w:hAnsi="Times New Roman" w:cs="Times New Roman"/>
-        </w:rPr>
-        <w:t xml:space="preserve">a </w:t>
-      </w:r>
-      <w:r>
-        <w:rPr>
-          <w:rFonts w:ascii="Times New Roman" w:hAnsi="Times New Roman" w:cs="Times New Roman"/>
-        </w:rPr>
-        <w:t>128-bit UUID for Time of Registration and Time of Access?</w:t>
+        <w:t xml:space="preserve">Where are the logs that show the </w:t>
+      </w:r>
+      <w:r>
+        <w:rPr>
+          <w:rFonts w:ascii="Times New Roman" w:hAnsi="Times New Roman" w:cs="Times New Roman"/>
+          <w:i/>
+          <w:iCs/>
+        </w:rPr>
+        <w:t>time of access</w:t>
+      </w:r>
+      <w:r>
+        <w:rPr>
+          <w:rFonts w:ascii="Times New Roman" w:hAnsi="Times New Roman" w:cs="Times New Roman"/>
+        </w:rPr>
+        <w:t xml:space="preserve"> outcome</w:t>
+      </w:r>
+      <w:r>
+        <w:rPr>
+          <w:rFonts w:ascii="Times New Roman" w:hAnsi="Times New Roman" w:cs="Times New Roman"/>
+        </w:rPr>
+        <w:t>?</w:t>
       </w:r>
     </w:p>
     <w:p>
@@ -940,7 +1177,65 @@
         <w:rPr>
           <w:rFonts w:ascii="Times New Roman" w:hAnsi="Times New Roman" w:cs="Times New Roman"/>
         </w:rPr>
-        <w:t>How do I determine what the PACS system uses as the primary identifier?</w:t>
+        <w:t xml:space="preserve">How </w:t>
+      </w:r>
+      <w:r>
+        <w:rPr>
+          <w:rFonts w:ascii="Times New Roman" w:hAnsi="Times New Roman" w:cs="Times New Roman"/>
+        </w:rPr>
+        <w:t xml:space="preserve">do you </w:t>
+      </w:r>
+      <w:r>
+        <w:rPr>
+          <w:rFonts w:ascii="Times New Roman" w:hAnsi="Times New Roman" w:cs="Times New Roman"/>
+        </w:rPr>
+        <w:t>disable</w:t>
+      </w:r>
+      <w:r>
+        <w:rPr>
+          <w:rFonts w:ascii="Times New Roman" w:hAnsi="Times New Roman" w:cs="Times New Roman"/>
+        </w:rPr>
+        <w:t xml:space="preserve"> certificate validation for the </w:t>
+      </w:r>
+      <w:r>
+        <w:rPr>
+          <w:rFonts w:ascii="Times New Roman" w:hAnsi="Times New Roman" w:cs="Times New Roman"/>
+        </w:rPr>
+        <w:t>duration</w:t>
+      </w:r>
+      <w:r>
+        <w:rPr>
+          <w:rFonts w:ascii="Times New Roman" w:hAnsi="Times New Roman" w:cs="Times New Roman"/>
+        </w:rPr>
+        <w:t xml:space="preserve"> of </w:t>
+      </w:r>
+      <w:r>
+        <w:rPr>
+          <w:rFonts w:ascii="Times New Roman" w:hAnsi="Times New Roman" w:cs="Times New Roman"/>
+        </w:rPr>
+        <w:t xml:space="preserve">the </w:t>
+      </w:r>
+      <w:r>
+        <w:rPr>
+          <w:rFonts w:ascii="Times New Roman" w:hAnsi="Times New Roman" w:cs="Times New Roman"/>
+          <w:i/>
+          <w:iCs/>
+        </w:rPr>
+        <w:t xml:space="preserve">time of </w:t>
+      </w:r>
+      <w:r>
+        <w:rPr>
+          <w:rFonts w:ascii="Times New Roman" w:hAnsi="Times New Roman" w:cs="Times New Roman"/>
+          <w:i/>
+          <w:iCs/>
+        </w:rPr>
+        <w:t>access</w:t>
+      </w:r>
+      <w:r>
+        <w:rPr>
+          <w:rFonts w:ascii="Times New Roman" w:hAnsi="Times New Roman" w:cs="Times New Roman"/>
+        </w:rPr>
+        <w:t>?</w:t>
       </w:r>
     </w:p>
     <w:p>
@@ -958,31 +1253,25 @@
         <w:rPr>
           <w:rFonts w:ascii="Times New Roman" w:hAnsi="Times New Roman" w:cs="Times New Roman"/>
         </w:rPr>
-        <w:t>Does the solution</w:t>
-      </w:r>
-      <w:r>
-        <w:rPr>
-          <w:rFonts w:ascii="Times New Roman" w:hAnsi="Times New Roman" w:cs="Times New Roman"/>
-        </w:rPr>
-        <w:t xml:space="preserve"> support the multifactor dynamic assignment of an individual </w:t>
-      </w:r>
-      <w:r>
-        <w:rPr>
-          <w:rFonts w:ascii="Times New Roman" w:hAnsi="Times New Roman" w:cs="Times New Roman"/>
-        </w:rPr>
-        <w:t xml:space="preserve">reader </w:t>
-      </w:r>
-      <w:r>
-        <w:rPr>
-          <w:rFonts w:ascii="Times New Roman" w:hAnsi="Times New Roman" w:cs="Times New Roman"/>
-        </w:rPr>
-        <w:t>authentication mode on a time-based schedule</w:t>
-      </w:r>
-      <w:r>
-        <w:rPr>
-          <w:rFonts w:ascii="Times New Roman" w:hAnsi="Times New Roman" w:cs="Times New Roman"/>
-        </w:rPr>
-        <w:t>?</w:t>
+        <w:t xml:space="preserve">Does your solution rely on a validation process within the PACS software to </w:t>
+      </w:r>
+      <w:r>
+        <w:rPr>
+          <w:rFonts w:ascii="Times New Roman" w:hAnsi="Times New Roman" w:cs="Times New Roman"/>
+        </w:rPr>
+        <w:t>updat</w:t>
+      </w:r>
+      <w:r>
+        <w:rPr>
+          <w:rFonts w:ascii="Times New Roman" w:hAnsi="Times New Roman" w:cs="Times New Roman"/>
+        </w:rPr>
+        <w:t xml:space="preserve">e the user status </w:t>
+      </w:r>
+      <w:r>
+        <w:rPr>
+          <w:rFonts w:ascii="Times New Roman" w:hAnsi="Times New Roman" w:cs="Times New Roman"/>
+        </w:rPr>
+        <w:t>during</w:t>
       </w:r>
       <w:r>
         <w:rPr>
@@ -993,32 +1282,60 @@
       <w:r>
         <w:rPr>
           <w:rFonts w:ascii="Times New Roman" w:hAnsi="Times New Roman" w:cs="Times New Roman"/>
-          <w:i/>
-          <w:iCs/>
-        </w:rPr>
-        <w:t>(</w:t>
-      </w:r>
-      <w:r>
-        <w:rPr>
-          <w:rFonts w:ascii="Times New Roman" w:hAnsi="Times New Roman" w:cs="Times New Roman"/>
-          <w:i/>
-          <w:iCs/>
-        </w:rPr>
-        <w:t xml:space="preserve">FRTC Test Cases </w:t>
-      </w:r>
-      <w:r>
-        <w:rPr>
-          <w:rFonts w:ascii="Times New Roman" w:hAnsi="Times New Roman" w:cs="Times New Roman"/>
-          <w:i/>
-          <w:iCs/>
-        </w:rPr>
-        <w:t>7.07.05 &amp; 7.07.06)</w:t>
-      </w:r>
-      <w:r>
-        <w:rPr>
-          <w:rFonts w:ascii="Times New Roman" w:hAnsi="Times New Roman" w:cs="Times New Roman"/>
-        </w:rPr>
-        <w:t xml:space="preserve"> If yes, how is it configured?</w:t>
+        </w:rPr>
+        <w:t xml:space="preserve">the </w:t>
+      </w:r>
+      <w:r>
+        <w:rPr>
+          <w:rFonts w:ascii="Times New Roman" w:hAnsi="Times New Roman" w:cs="Times New Roman"/>
+          <w:i/>
+          <w:iCs/>
+        </w:rPr>
+        <w:t xml:space="preserve">time of </w:t>
+      </w:r>
+      <w:r>
+        <w:rPr>
+          <w:rFonts w:ascii="Times New Roman" w:hAnsi="Times New Roman" w:cs="Times New Roman"/>
+          <w:i/>
+          <w:iCs/>
+        </w:rPr>
+        <w:t>access</w:t>
+      </w:r>
+      <w:r>
+        <w:rPr>
+          <w:rFonts w:ascii="Times New Roman" w:hAnsi="Times New Roman" w:cs="Times New Roman"/>
+        </w:rPr>
+        <w:t xml:space="preserve"> test cases</w:t>
+      </w:r>
+      <w:r>
+        <w:rPr>
+          <w:rFonts w:ascii="Times New Roman" w:hAnsi="Times New Roman" w:cs="Times New Roman"/>
+        </w:rPr>
+        <w:t>,</w:t>
+      </w:r>
+      <w:r>
+        <w:rPr>
+          <w:rFonts w:ascii="Times New Roman" w:hAnsi="Times New Roman" w:cs="Times New Roman"/>
+        </w:rPr>
+        <w:t xml:space="preserve"> </w:t>
+      </w:r>
+      <w:r>
+        <w:rPr>
+          <w:rFonts w:ascii="Times New Roman" w:hAnsi="Times New Roman" w:cs="Times New Roman"/>
+        </w:rPr>
+        <w:t>ensuring</w:t>
+      </w:r>
+      <w:r>
+        <w:rPr>
+          <w:rFonts w:ascii="Times New Roman" w:hAnsi="Times New Roman" w:cs="Times New Roman"/>
+        </w:rPr>
+        <w:t xml:space="preserve"> they </w:t>
+      </w:r>
+      <w:r>
+        <w:rPr>
+          <w:rFonts w:ascii="Times New Roman" w:hAnsi="Times New Roman" w:cs="Times New Roman"/>
+        </w:rPr>
+        <w:t>respond as expected?</w:t>
       </w:r>
     </w:p>
     <w:p>
@@ -1036,49 +1353,7 @@
         <w:rPr>
           <w:rFonts w:ascii="Times New Roman" w:hAnsi="Times New Roman" w:cs="Times New Roman"/>
         </w:rPr>
-        <w:t>For new contact PACS readers, t</w:t>
-      </w:r>
-      <w:r>
-        <w:rPr>
-          <w:rFonts w:ascii="Times New Roman" w:hAnsi="Times New Roman" w:cs="Times New Roman"/>
-        </w:rPr>
-        <w:t>he vendor shall provide a test data report documenting conformance for review and approval of contact readers</w:t>
-      </w:r>
-      <w:r>
-        <w:rPr>
-          <w:rFonts w:ascii="Times New Roman" w:hAnsi="Times New Roman" w:cs="Times New Roman"/>
-        </w:rPr>
-        <w:t>, which</w:t>
-      </w:r>
-      <w:r>
-        <w:rPr>
-          <w:rFonts w:ascii="Times New Roman" w:hAnsi="Times New Roman" w:cs="Times New Roman"/>
-        </w:rPr>
-        <w:t xml:space="preserve"> shall support ISO/IEC 7816 </w:t>
-      </w:r>
-      <w:r>
-        <w:rPr>
-          <w:rFonts w:ascii="Times New Roman" w:hAnsi="Times New Roman" w:cs="Times New Roman"/>
-          <w:i/>
-          <w:iCs/>
-        </w:rPr>
-        <w:t>(</w:t>
-      </w:r>
-      <w:r>
-        <w:rPr>
-          <w:rFonts w:ascii="Times New Roman" w:hAnsi="Times New Roman" w:cs="Times New Roman"/>
-          <w:i/>
-          <w:iCs/>
-        </w:rPr>
-        <w:t xml:space="preserve">FRTC Test Case </w:t>
-      </w:r>
-      <w:r>
-        <w:rPr>
-          <w:rFonts w:ascii="Times New Roman" w:hAnsi="Times New Roman" w:cs="Times New Roman"/>
-          <w:i/>
-          <w:iCs/>
-        </w:rPr>
-        <w:t>7.07.09)</w:t>
+        <w:t>If your solution uses OSDP, where do I find the configuration to confirm it is sent for encrypted traffic between the controller (ACU) and the reader (PD)?</w:t>
       </w:r>
     </w:p>
     <w:p>
@@ -1090,45 +1365,57 @@
         </w:numPr>
         <w:rPr>
           <w:rFonts w:ascii="Times New Roman" w:hAnsi="Times New Roman" w:cs="Times New Roman"/>
-          <w:i/>
-          <w:iCs/>
-        </w:rPr>
-      </w:pPr>
-      <w:r>
-        <w:rPr>
-          <w:rFonts w:ascii="Times New Roman" w:hAnsi="Times New Roman" w:cs="Times New Roman"/>
-        </w:rPr>
-        <w:t>For new contactless PACS readers, t</w:t>
-      </w:r>
-      <w:r>
-        <w:rPr>
-          <w:rFonts w:ascii="Times New Roman" w:hAnsi="Times New Roman" w:cs="Times New Roman"/>
-        </w:rPr>
-        <w:t xml:space="preserve">he vendor shall provide a test data report documenting conformance for review, and approval of contactless readers shall support ISO/IEC 14443 Type A </w:t>
-      </w:r>
-      <w:r>
-        <w:rPr>
-          <w:rFonts w:ascii="Times New Roman" w:hAnsi="Times New Roman" w:cs="Times New Roman"/>
-          <w:i/>
-          <w:iCs/>
-        </w:rPr>
-        <w:t>(</w:t>
-      </w:r>
-      <w:r>
-        <w:rPr>
-          <w:rFonts w:ascii="Times New Roman" w:hAnsi="Times New Roman" w:cs="Times New Roman"/>
-          <w:i/>
-          <w:iCs/>
-        </w:rPr>
-        <w:t xml:space="preserve">FRTC Test Case </w:t>
-      </w:r>
-      <w:r>
-        <w:rPr>
-          <w:rFonts w:ascii="Times New Roman" w:hAnsi="Times New Roman" w:cs="Times New Roman"/>
-          <w:i/>
-          <w:iCs/>
-        </w:rPr>
-        <w:t>7.07.10)</w:t>
+        </w:rPr>
+      </w:pPr>
+      <w:bookmarkStart w:id="0" w:name="OLE_LINK1"/>
+      <w:r>
+        <w:rPr>
+          <w:rFonts w:ascii="Times New Roman" w:hAnsi="Times New Roman" w:cs="Times New Roman"/>
+        </w:rPr>
+        <w:t xml:space="preserve">How </w:t>
+      </w:r>
+      <w:r>
+        <w:rPr>
+          <w:rFonts w:ascii="Times New Roman" w:hAnsi="Times New Roman" w:cs="Times New Roman"/>
+        </w:rPr>
+        <w:t>to</w:t>
+      </w:r>
+      <w:r>
+        <w:rPr>
+          <w:rFonts w:ascii="Times New Roman" w:hAnsi="Times New Roman" w:cs="Times New Roman"/>
+        </w:rPr>
+        <w:t xml:space="preserve"> </w:t>
+      </w:r>
+      <w:r>
+        <w:rPr>
+          <w:rFonts w:ascii="Times New Roman" w:hAnsi="Times New Roman" w:cs="Times New Roman"/>
+        </w:rPr>
+        <w:t>change authentication modes on the reade</w:t>
+      </w:r>
+      <w:bookmarkEnd w:id="0"/>
+      <w:r>
+        <w:rPr>
+          <w:rFonts w:ascii="Times New Roman" w:hAnsi="Times New Roman" w:cs="Times New Roman"/>
+        </w:rPr>
+        <w:t>r</w:t>
+      </w:r>
+      <w:r>
+        <w:rPr>
+          <w:rFonts w:ascii="Times New Roman" w:hAnsi="Times New Roman" w:cs="Times New Roman"/>
+        </w:rPr>
+        <w:t xml:space="preserve">(s) </w:t>
+      </w:r>
+      <w:r>
+        <w:rPr>
+          <w:rFonts w:ascii="Times New Roman" w:hAnsi="Times New Roman" w:cs="Times New Roman"/>
+        </w:rPr>
+        <w:t>(PKI-CAK, PKI-AUTH, PKI-CAK+BIO, PKI-AUTH+BIO)</w:t>
+      </w:r>
+      <w:r>
+        <w:rPr>
+          <w:rFonts w:ascii="Times New Roman" w:hAnsi="Times New Roman" w:cs="Times New Roman"/>
+        </w:rPr>
+        <w:t>?</w:t>
       </w:r>
     </w:p>
     <w:p>
@@ -1140,87 +1427,39 @@
         </w:numPr>
         <w:rPr>
           <w:rFonts w:ascii="Times New Roman" w:hAnsi="Times New Roman" w:cs="Times New Roman"/>
-        </w:rPr>
-      </w:pPr>
-      <w:r>
-        <w:rPr>
-          <w:rFonts w:ascii="Times New Roman" w:hAnsi="Times New Roman" w:cs="Times New Roman"/>
-        </w:rPr>
-        <w:t xml:space="preserve">The vendor shall </w:t>
-      </w:r>
-      <w:r>
-        <w:rPr>
-          <w:rFonts w:ascii="Times New Roman" w:hAnsi="Times New Roman" w:cs="Times New Roman"/>
-        </w:rPr>
-        <w:t xml:space="preserve">confirm the </w:t>
-      </w:r>
-      <w:r>
-        <w:rPr>
-          <w:rFonts w:ascii="Times New Roman" w:hAnsi="Times New Roman" w:cs="Times New Roman"/>
-        </w:rPr>
-        <w:t xml:space="preserve">item doing the crypto at </w:t>
-      </w:r>
-      <w:r>
-        <w:rPr>
-          <w:rFonts w:ascii="Times New Roman" w:hAnsi="Times New Roman" w:cs="Times New Roman"/>
-        </w:rPr>
-        <w:t xml:space="preserve">the </w:t>
-      </w:r>
-      <w:r>
-        <w:rPr>
-          <w:rFonts w:ascii="Times New Roman" w:hAnsi="Times New Roman" w:cs="Times New Roman"/>
-        </w:rPr>
-        <w:t>Time of Access (Reader or Controller)</w:t>
-      </w:r>
-      <w:r>
-        <w:rPr>
-          <w:rFonts w:ascii="Times New Roman" w:hAnsi="Times New Roman" w:cs="Times New Roman"/>
-        </w:rPr>
-        <w:t xml:space="preserve"> and </w:t>
-      </w:r>
-      <w:r>
-        <w:rPr>
-          <w:rFonts w:ascii="Times New Roman" w:hAnsi="Times New Roman" w:cs="Times New Roman"/>
-        </w:rPr>
-        <w:t xml:space="preserve">provide </w:t>
-      </w:r>
-      <w:r>
-        <w:rPr>
-          <w:rFonts w:ascii="Times New Roman" w:hAnsi="Times New Roman" w:cs="Times New Roman"/>
-        </w:rPr>
-        <w:t xml:space="preserve">the </w:t>
-      </w:r>
-      <w:r>
-        <w:rPr>
-          <w:rFonts w:ascii="Times New Roman" w:hAnsi="Times New Roman" w:cs="Times New Roman"/>
-        </w:rPr>
-        <w:t xml:space="preserve">CMVP certificate number for the </w:t>
-      </w:r>
-      <w:r>
-        <w:rPr>
-          <w:rFonts w:ascii="Times New Roman" w:hAnsi="Times New Roman" w:cs="Times New Roman"/>
-        </w:rPr>
-        <w:t>item</w:t>
-      </w:r>
-      <w:r>
-        <w:rPr>
-          <w:rFonts w:ascii="Times New Roman" w:hAnsi="Times New Roman" w:cs="Times New Roman"/>
-        </w:rPr>
-        <w:t xml:space="preserve"> as required in the </w:t>
-      </w:r>
-      <w:r>
-        <w:rPr>
-          <w:rFonts w:ascii="Times New Roman" w:hAnsi="Times New Roman" w:cs="Times New Roman"/>
-          <w:i/>
-          <w:iCs/>
-        </w:rPr>
-        <w:t>FRTC test case 7.09.05</w:t>
-      </w:r>
-      <w:r>
-        <w:rPr>
-          <w:rFonts w:ascii="Times New Roman" w:hAnsi="Times New Roman" w:cs="Times New Roman"/>
-        </w:rPr>
-        <w:t>.</w:t>
+          <w:i/>
+          <w:iCs/>
+        </w:rPr>
+      </w:pPr>
+      <w:r>
+        <w:rPr>
+          <w:rFonts w:ascii="Times New Roman" w:hAnsi="Times New Roman" w:cs="Times New Roman"/>
+        </w:rPr>
+        <w:t xml:space="preserve">How can the negotiated bit rate on the contact reader be changed to 446 KBps? </w:t>
+      </w:r>
+      <w:r>
+        <w:rPr>
+          <w:rFonts w:ascii="Times New Roman" w:hAnsi="Times New Roman" w:cs="Times New Roman"/>
+          <w:i/>
+          <w:iCs/>
+        </w:rPr>
+        <w:t>(</w:t>
+      </w:r>
+      <w:r>
+        <w:rPr>
+          <w:rFonts w:ascii="Times New Roman" w:hAnsi="Times New Roman" w:cs="Times New Roman"/>
+          <w:i/>
+          <w:iCs/>
+        </w:rPr>
+        <w:t xml:space="preserve">FRTC Test Case </w:t>
+      </w:r>
+      <w:r>
+        <w:rPr>
+          <w:rFonts w:ascii="Times New Roman" w:hAnsi="Times New Roman" w:cs="Times New Roman"/>
+          <w:i/>
+          <w:iCs/>
+        </w:rPr>
+        <w:t>5.18.01)</w:t>
       </w:r>
     </w:p>
     <w:p>
@@ -1238,93 +1477,31 @@
         <w:rPr>
           <w:rFonts w:ascii="Times New Roman" w:hAnsi="Times New Roman" w:cs="Times New Roman"/>
         </w:rPr>
-        <w:t xml:space="preserve"> Does the solution leverage a cached copy of the public key extracted at the </w:t>
-      </w:r>
-      <w:r>
-        <w:rPr>
-          <w:rFonts w:ascii="Times New Roman" w:hAnsi="Times New Roman" w:cs="Times New Roman"/>
-          <w:i/>
-          <w:iCs/>
-        </w:rPr>
-        <w:t>time of</w:t>
-      </w:r>
-      <w:r>
-        <w:rPr>
-          <w:rFonts w:ascii="Times New Roman" w:hAnsi="Times New Roman" w:cs="Times New Roman"/>
-          <w:i/>
-          <w:iCs/>
-        </w:rPr>
-        <w:t xml:space="preserve"> </w:t>
-      </w:r>
-      <w:r>
-        <w:rPr>
-          <w:rFonts w:ascii="Times New Roman" w:hAnsi="Times New Roman" w:cs="Times New Roman"/>
-          <w:i/>
-          <w:iCs/>
-        </w:rPr>
-        <w:t>registration</w:t>
-      </w:r>
-      <w:r>
-        <w:rPr>
-          <w:rFonts w:ascii="Times New Roman" w:hAnsi="Times New Roman" w:cs="Times New Roman"/>
-        </w:rPr>
-        <w:t xml:space="preserve"> for</w:t>
-      </w:r>
-      <w:r>
-        <w:rPr>
-          <w:rFonts w:ascii="Times New Roman" w:hAnsi="Times New Roman" w:cs="Times New Roman"/>
-        </w:rPr>
-        <w:t xml:space="preserve"> </w:t>
-      </w:r>
-      <w:r>
-        <w:rPr>
-          <w:rFonts w:ascii="Times New Roman" w:hAnsi="Times New Roman" w:cs="Times New Roman"/>
-        </w:rPr>
-        <w:t xml:space="preserve">signature verification at the </w:t>
-      </w:r>
-      <w:r>
-        <w:rPr>
-          <w:rFonts w:ascii="Times New Roman" w:hAnsi="Times New Roman" w:cs="Times New Roman"/>
-          <w:i/>
-          <w:iCs/>
-        </w:rPr>
-        <w:t>t</w:t>
-      </w:r>
-      <w:r>
-        <w:rPr>
-          <w:rFonts w:ascii="Times New Roman" w:hAnsi="Times New Roman" w:cs="Times New Roman"/>
-          <w:i/>
-          <w:iCs/>
-        </w:rPr>
-        <w:t xml:space="preserve">ime of </w:t>
-      </w:r>
-      <w:r>
-        <w:rPr>
-          <w:rFonts w:ascii="Times New Roman" w:hAnsi="Times New Roman" w:cs="Times New Roman"/>
-          <w:i/>
-          <w:iCs/>
-        </w:rPr>
-        <w:t>a</w:t>
-      </w:r>
-      <w:r>
-        <w:rPr>
-          <w:rFonts w:ascii="Times New Roman" w:hAnsi="Times New Roman" w:cs="Times New Roman"/>
-          <w:i/>
-          <w:iCs/>
-        </w:rPr>
-        <w:t>ccess</w:t>
-      </w:r>
-      <w:r>
-        <w:rPr>
-          <w:rFonts w:ascii="Times New Roman" w:hAnsi="Times New Roman" w:cs="Times New Roman"/>
-        </w:rPr>
-        <w:t>? (5.02.06)</w:t>
-      </w:r>
-      <w:r>
-        <w:rPr>
-          <w:rFonts w:ascii="Times New Roman" w:hAnsi="Times New Roman" w:cs="Times New Roman"/>
-        </w:rPr>
-        <w:t xml:space="preserve"> </w:t>
+        <w:t xml:space="preserve">How can the negotiated bit rate on the contactless reader be changed to 848 KBps? </w:t>
+      </w:r>
+      <w:r>
+        <w:rPr>
+          <w:rFonts w:ascii="Times New Roman" w:hAnsi="Times New Roman" w:cs="Times New Roman"/>
+          <w:i/>
+          <w:iCs/>
+        </w:rPr>
+        <w:t>(</w:t>
+      </w:r>
+      <w:r>
+        <w:rPr>
+          <w:rFonts w:ascii="Times New Roman" w:hAnsi="Times New Roman" w:cs="Times New Roman"/>
+          <w:i/>
+          <w:iCs/>
+        </w:rPr>
+        <w:t xml:space="preserve">FRTC Test Case </w:t>
+      </w:r>
+      <w:r>
+        <w:rPr>
+          <w:rFonts w:ascii="Times New Roman" w:hAnsi="Times New Roman" w:cs="Times New Roman"/>
+          <w:i/>
+          <w:iCs/>
+        </w:rPr>
+        <w:t>5.18.02)</w:t>
       </w:r>
     </w:p>
     <w:p>
@@ -1342,7 +1519,77 @@
         <w:rPr>
           <w:rFonts w:ascii="Times New Roman" w:hAnsi="Times New Roman" w:cs="Times New Roman"/>
         </w:rPr>
-        <w:t>Does the solution support SM-Auth?</w:t>
+        <w:t xml:space="preserve">How </w:t>
+      </w:r>
+      <w:r>
+        <w:rPr>
+          <w:rFonts w:ascii="Times New Roman" w:hAnsi="Times New Roman" w:cs="Times New Roman"/>
+        </w:rPr>
+        <w:t xml:space="preserve">do you </w:t>
+      </w:r>
+      <w:r>
+        <w:rPr>
+          <w:rFonts w:ascii="Times New Roman" w:hAnsi="Times New Roman" w:cs="Times New Roman"/>
+        </w:rPr>
+        <w:t xml:space="preserve">configure the software application to support </w:t>
+      </w:r>
+      <w:r>
+        <w:rPr>
+          <w:rFonts w:ascii="Times New Roman" w:hAnsi="Times New Roman" w:cs="Times New Roman"/>
+        </w:rPr>
+        <w:t>the use of</w:t>
+      </w:r>
+      <w:r>
+        <w:rPr>
+          <w:rFonts w:ascii="Times New Roman" w:hAnsi="Times New Roman" w:cs="Times New Roman"/>
+        </w:rPr>
+        <w:t xml:space="preserve"> 128-bit FASC-N </w:t>
+      </w:r>
+      <w:r>
+        <w:rPr>
+          <w:rFonts w:ascii="Times New Roman" w:hAnsi="Times New Roman" w:cs="Times New Roman"/>
+        </w:rPr>
+        <w:t>at</w:t>
+      </w:r>
+      <w:r>
+        <w:rPr>
+          <w:rFonts w:ascii="Times New Roman" w:hAnsi="Times New Roman" w:cs="Times New Roman"/>
+        </w:rPr>
+        <w:t xml:space="preserve"> </w:t>
+      </w:r>
+      <w:r>
+        <w:rPr>
+          <w:rFonts w:ascii="Times New Roman" w:hAnsi="Times New Roman" w:cs="Times New Roman"/>
+        </w:rPr>
+        <w:t xml:space="preserve">the </w:t>
+      </w:r>
+      <w:r>
+        <w:rPr>
+          <w:rFonts w:ascii="Times New Roman" w:hAnsi="Times New Roman" w:cs="Times New Roman"/>
+          <w:i/>
+          <w:iCs/>
+        </w:rPr>
+        <w:t>Time of Registration</w:t>
+      </w:r>
+      <w:r>
+        <w:rPr>
+          <w:rFonts w:ascii="Times New Roman" w:hAnsi="Times New Roman" w:cs="Times New Roman"/>
+        </w:rPr>
+        <w:t xml:space="preserve"> and </w:t>
+      </w:r>
+      <w:r>
+        <w:rPr>
+          <w:rFonts w:ascii="Times New Roman" w:hAnsi="Times New Roman" w:cs="Times New Roman"/>
+          <w:i/>
+          <w:iCs/>
+        </w:rPr>
+        <w:t>Time of Access</w:t>
+      </w:r>
+      <w:r>
+        <w:rPr>
+          <w:rFonts w:ascii="Times New Roman" w:hAnsi="Times New Roman" w:cs="Times New Roman"/>
+        </w:rPr>
+        <w:t>?</w:t>
       </w:r>
     </w:p>
     <w:p>
@@ -1360,7 +1607,84 @@
         <w:rPr>
           <w:rFonts w:ascii="Times New Roman" w:hAnsi="Times New Roman" w:cs="Times New Roman"/>
         </w:rPr>
-        <w:t>Does the solution support OCC-Auth?</w:t>
+        <w:lastRenderedPageBreak/>
+        <w:t xml:space="preserve">How </w:t>
+      </w:r>
+      <w:r>
+        <w:rPr>
+          <w:rFonts w:ascii="Times New Roman" w:hAnsi="Times New Roman" w:cs="Times New Roman"/>
+        </w:rPr>
+        <w:t xml:space="preserve">do you </w:t>
+      </w:r>
+      <w:r>
+        <w:rPr>
+          <w:rFonts w:ascii="Times New Roman" w:hAnsi="Times New Roman" w:cs="Times New Roman"/>
+        </w:rPr>
+        <w:t xml:space="preserve">configure the software application to support </w:t>
+      </w:r>
+      <w:r>
+        <w:rPr>
+          <w:rFonts w:ascii="Times New Roman" w:hAnsi="Times New Roman" w:cs="Times New Roman"/>
+        </w:rPr>
+        <w:t>the use of</w:t>
+      </w:r>
+      <w:r>
+        <w:rPr>
+          <w:rFonts w:ascii="Times New Roman" w:hAnsi="Times New Roman" w:cs="Times New Roman"/>
+        </w:rPr>
+        <w:t xml:space="preserve"> </w:t>
+      </w:r>
+      <w:r>
+        <w:rPr>
+          <w:rFonts w:ascii="Times New Roman" w:hAnsi="Times New Roman" w:cs="Times New Roman"/>
+        </w:rPr>
+        <w:t xml:space="preserve">a </w:t>
+      </w:r>
+      <w:r>
+        <w:rPr>
+          <w:rFonts w:ascii="Times New Roman" w:hAnsi="Times New Roman" w:cs="Times New Roman"/>
+        </w:rPr>
+        <w:t xml:space="preserve">128-bit UUID </w:t>
+      </w:r>
+      <w:r>
+        <w:rPr>
+          <w:rFonts w:ascii="Times New Roman" w:hAnsi="Times New Roman" w:cs="Times New Roman"/>
+        </w:rPr>
+        <w:t>at the</w:t>
+      </w:r>
+      <w:r>
+        <w:rPr>
+          <w:rFonts w:ascii="Times New Roman" w:hAnsi="Times New Roman" w:cs="Times New Roman"/>
+        </w:rPr>
+        <w:t xml:space="preserve"> </w:t>
+      </w:r>
+      <w:r>
+        <w:rPr>
+          <w:rFonts w:ascii="Times New Roman" w:hAnsi="Times New Roman" w:cs="Times New Roman"/>
+          <w:i/>
+          <w:iCs/>
+        </w:rPr>
+        <w:t>Time of Registration</w:t>
+      </w:r>
+      <w:r>
+        <w:rPr>
+          <w:rFonts w:ascii="Times New Roman" w:hAnsi="Times New Roman" w:cs="Times New Roman"/>
+        </w:rPr>
+        <w:t xml:space="preserve"> and </w:t>
+      </w:r>
+      <w:r>
+        <w:rPr>
+          <w:rFonts w:ascii="Times New Roman" w:hAnsi="Times New Roman" w:cs="Times New Roman"/>
+          <w:i/>
+          <w:iCs/>
+        </w:rPr>
+        <w:t>Time of Access</w:t>
+      </w:r>
+      <w:r>
+        <w:rPr>
+          <w:rFonts w:ascii="Times New Roman" w:hAnsi="Times New Roman" w:cs="Times New Roman"/>
+        </w:rPr>
+        <w:t>?</w:t>
       </w:r>
     </w:p>
     <w:p>
@@ -1378,31 +1702,67 @@
         <w:rPr>
           <w:rFonts w:ascii="Times New Roman" w:hAnsi="Times New Roman" w:cs="Times New Roman"/>
         </w:rPr>
-        <w:t xml:space="preserve">How do you </w:t>
-      </w:r>
-      <w:r>
-        <w:rPr>
-          <w:rFonts w:ascii="Times New Roman" w:hAnsi="Times New Roman" w:cs="Times New Roman"/>
-        </w:rPr>
-        <w:t>enable</w:t>
-      </w:r>
-      <w:r>
-        <w:rPr>
-          <w:rFonts w:ascii="Times New Roman" w:hAnsi="Times New Roman" w:cs="Times New Roman"/>
-        </w:rPr>
-        <w:t xml:space="preserve"> fingerprint verification for enrollment</w:t>
-      </w:r>
-      <w:r>
-        <w:rPr>
-          <w:rFonts w:ascii="Times New Roman" w:hAnsi="Times New Roman" w:cs="Times New Roman"/>
-        </w:rPr>
-        <w:t xml:space="preserve"> or </w:t>
-      </w:r>
-      <w:r>
-        <w:rPr>
-          <w:rFonts w:ascii="Times New Roman" w:hAnsi="Times New Roman" w:cs="Times New Roman"/>
-        </w:rPr>
-        <w:t>registration?</w:t>
+        <w:t>Does the solution</w:t>
+      </w:r>
+      <w:r>
+        <w:rPr>
+          <w:rFonts w:ascii="Times New Roman" w:hAnsi="Times New Roman" w:cs="Times New Roman"/>
+        </w:rPr>
+        <w:t xml:space="preserve"> support the multifactor dynamic assignment of an individual </w:t>
+      </w:r>
+      <w:r>
+        <w:rPr>
+          <w:rFonts w:ascii="Times New Roman" w:hAnsi="Times New Roman" w:cs="Times New Roman"/>
+        </w:rPr>
+        <w:t xml:space="preserve">reader </w:t>
+      </w:r>
+      <w:r>
+        <w:rPr>
+          <w:rFonts w:ascii="Times New Roman" w:hAnsi="Times New Roman" w:cs="Times New Roman"/>
+        </w:rPr>
+        <w:t>authentication mode on a time-based schedule</w:t>
+      </w:r>
+      <w:r>
+        <w:rPr>
+          <w:rFonts w:ascii="Times New Roman" w:hAnsi="Times New Roman" w:cs="Times New Roman"/>
+        </w:rPr>
+        <w:t>?</w:t>
+      </w:r>
+      <w:r>
+        <w:rPr>
+          <w:rFonts w:ascii="Times New Roman" w:hAnsi="Times New Roman" w:cs="Times New Roman"/>
+        </w:rPr>
+        <w:t xml:space="preserve"> </w:t>
+      </w:r>
+      <w:r>
+        <w:rPr>
+          <w:rFonts w:ascii="Times New Roman" w:hAnsi="Times New Roman" w:cs="Times New Roman"/>
+          <w:i/>
+          <w:iCs/>
+        </w:rPr>
+        <w:t>(</w:t>
+      </w:r>
+      <w:r>
+        <w:rPr>
+          <w:rFonts w:ascii="Times New Roman" w:hAnsi="Times New Roman" w:cs="Times New Roman"/>
+          <w:i/>
+          <w:iCs/>
+        </w:rPr>
+        <w:t xml:space="preserve">FRTC Test Cases </w:t>
+      </w:r>
+      <w:r>
+        <w:rPr>
+          <w:rFonts w:ascii="Times New Roman" w:hAnsi="Times New Roman" w:cs="Times New Roman"/>
+          <w:i/>
+          <w:iCs/>
+        </w:rPr>
+        <w:t>7.07.05 &amp; 7.07.06)</w:t>
+      </w:r>
+      <w:r>
+        <w:rPr>
+          <w:rFonts w:ascii="Times New Roman" w:hAnsi="Times New Roman" w:cs="Times New Roman"/>
+        </w:rPr>
+        <w:t xml:space="preserve"> If yes, how is it configured?</w:t>
       </w:r>
     </w:p>
     <w:p>
@@ -1420,32 +1780,49 @@
         <w:rPr>
           <w:rFonts w:ascii="Times New Roman" w:hAnsi="Times New Roman" w:cs="Times New Roman"/>
         </w:rPr>
-        <w:lastRenderedPageBreak/>
-        <w:t xml:space="preserve">How do you </w:t>
-      </w:r>
-      <w:r>
-        <w:rPr>
-          <w:rFonts w:ascii="Times New Roman" w:hAnsi="Times New Roman" w:cs="Times New Roman"/>
-        </w:rPr>
-        <w:t>turn off</w:t>
-      </w:r>
-      <w:r>
-        <w:rPr>
-          <w:rFonts w:ascii="Times New Roman" w:hAnsi="Times New Roman" w:cs="Times New Roman"/>
-        </w:rPr>
-        <w:t xml:space="preserve"> fingerprint verification for enrollment</w:t>
-      </w:r>
-      <w:r>
-        <w:rPr>
-          <w:rFonts w:ascii="Times New Roman" w:hAnsi="Times New Roman" w:cs="Times New Roman"/>
-        </w:rPr>
-        <w:t xml:space="preserve"> or </w:t>
-      </w:r>
-      <w:r>
-        <w:rPr>
-          <w:rFonts w:ascii="Times New Roman" w:hAnsi="Times New Roman" w:cs="Times New Roman"/>
-        </w:rPr>
-        <w:t>registration?</w:t>
+        <w:t>For new contact PACS readers, t</w:t>
+      </w:r>
+      <w:r>
+        <w:rPr>
+          <w:rFonts w:ascii="Times New Roman" w:hAnsi="Times New Roman" w:cs="Times New Roman"/>
+        </w:rPr>
+        <w:t>he vendor shall provide a test data report documenting conformance for review and approval of contact readers</w:t>
+      </w:r>
+      <w:r>
+        <w:rPr>
+          <w:rFonts w:ascii="Times New Roman" w:hAnsi="Times New Roman" w:cs="Times New Roman"/>
+        </w:rPr>
+        <w:t>, which</w:t>
+      </w:r>
+      <w:r>
+        <w:rPr>
+          <w:rFonts w:ascii="Times New Roman" w:hAnsi="Times New Roman" w:cs="Times New Roman"/>
+        </w:rPr>
+        <w:t xml:space="preserve"> shall support ISO/IEC 7816 </w:t>
+      </w:r>
+      <w:r>
+        <w:rPr>
+          <w:rFonts w:ascii="Times New Roman" w:hAnsi="Times New Roman" w:cs="Times New Roman"/>
+          <w:i/>
+          <w:iCs/>
+        </w:rPr>
+        <w:t>(</w:t>
+      </w:r>
+      <w:r>
+        <w:rPr>
+          <w:rFonts w:ascii="Times New Roman" w:hAnsi="Times New Roman" w:cs="Times New Roman"/>
+          <w:i/>
+          <w:iCs/>
+        </w:rPr>
+        <w:t xml:space="preserve">FRTC Test Case </w:t>
+      </w:r>
+      <w:r>
+        <w:rPr>
+          <w:rFonts w:ascii="Times New Roman" w:hAnsi="Times New Roman" w:cs="Times New Roman"/>
+          <w:i/>
+          <w:iCs/>
+        </w:rPr>
+        <w:t>7.07.09)</w:t>
       </w:r>
     </w:p>
     <w:p>
@@ -1457,13 +1834,261 @@
         </w:numPr>
         <w:rPr>
           <w:rFonts w:ascii="Times New Roman" w:hAnsi="Times New Roman" w:cs="Times New Roman"/>
-        </w:rPr>
-      </w:pPr>
-      <w:r>
-        <w:rPr>
-          <w:rFonts w:ascii="Times New Roman" w:hAnsi="Times New Roman" w:cs="Times New Roman"/>
-        </w:rPr>
-        <w:t xml:space="preserve">What objects/values are read from the PIV Card at enrollment? </w:t>
+          <w:i/>
+          <w:iCs/>
+        </w:rPr>
+      </w:pPr>
+      <w:r>
+        <w:rPr>
+          <w:rFonts w:ascii="Times New Roman" w:hAnsi="Times New Roman" w:cs="Times New Roman"/>
+        </w:rPr>
+        <w:t>For new contactless PACS readers, t</w:t>
+      </w:r>
+      <w:r>
+        <w:rPr>
+          <w:rFonts w:ascii="Times New Roman" w:hAnsi="Times New Roman" w:cs="Times New Roman"/>
+        </w:rPr>
+        <w:t xml:space="preserve">he vendor shall provide a test data report documenting conformance for review, and approval of contactless readers shall support ISO/IEC 14443 Type A </w:t>
+      </w:r>
+      <w:r>
+        <w:rPr>
+          <w:rFonts w:ascii="Times New Roman" w:hAnsi="Times New Roman" w:cs="Times New Roman"/>
+          <w:i/>
+          <w:iCs/>
+        </w:rPr>
+        <w:t>(</w:t>
+      </w:r>
+      <w:r>
+        <w:rPr>
+          <w:rFonts w:ascii="Times New Roman" w:hAnsi="Times New Roman" w:cs="Times New Roman"/>
+          <w:i/>
+          <w:iCs/>
+        </w:rPr>
+        <w:t xml:space="preserve">FRTC Test Case </w:t>
+      </w:r>
+      <w:r>
+        <w:rPr>
+          <w:rFonts w:ascii="Times New Roman" w:hAnsi="Times New Roman" w:cs="Times New Roman"/>
+          <w:i/>
+          <w:iCs/>
+        </w:rPr>
+        <w:t>7.07.10)</w:t>
+      </w:r>
+    </w:p>
+    <w:p>
+      <w:pPr>
+        <w:pStyle w:val="ListParagraph"/>
+        <w:numPr>
+          <w:ilvl w:val="0"/>
+          <w:numId w:val="1"/>
+        </w:numPr>
+        <w:rPr>
+          <w:rFonts w:ascii="Times New Roman" w:hAnsi="Times New Roman" w:cs="Times New Roman"/>
+        </w:rPr>
+      </w:pPr>
+      <w:r>
+        <w:rPr>
+          <w:rFonts w:ascii="Times New Roman" w:hAnsi="Times New Roman" w:cs="Times New Roman"/>
+        </w:rPr>
+        <w:t xml:space="preserve">The vendor shall </w:t>
+      </w:r>
+      <w:r>
+        <w:rPr>
+          <w:rFonts w:ascii="Times New Roman" w:hAnsi="Times New Roman" w:cs="Times New Roman"/>
+        </w:rPr>
+        <w:t xml:space="preserve">confirm the </w:t>
+      </w:r>
+      <w:r>
+        <w:rPr>
+          <w:rFonts w:ascii="Times New Roman" w:hAnsi="Times New Roman" w:cs="Times New Roman"/>
+        </w:rPr>
+        <w:t xml:space="preserve">item doing the crypto at </w:t>
+      </w:r>
+      <w:r>
+        <w:rPr>
+          <w:rFonts w:ascii="Times New Roman" w:hAnsi="Times New Roman" w:cs="Times New Roman"/>
+        </w:rPr>
+        <w:t xml:space="preserve">the </w:t>
+      </w:r>
+      <w:r>
+        <w:rPr>
+          <w:rFonts w:ascii="Times New Roman" w:hAnsi="Times New Roman" w:cs="Times New Roman"/>
+          <w:i/>
+          <w:iCs/>
+        </w:rPr>
+        <w:t>Time of Access</w:t>
+      </w:r>
+      <w:r>
+        <w:rPr>
+          <w:rFonts w:ascii="Times New Roman" w:hAnsi="Times New Roman" w:cs="Times New Roman"/>
+        </w:rPr>
+        <w:t xml:space="preserve"> (Reader or Controller)</w:t>
+      </w:r>
+      <w:r>
+        <w:rPr>
+          <w:rFonts w:ascii="Times New Roman" w:hAnsi="Times New Roman" w:cs="Times New Roman"/>
+        </w:rPr>
+        <w:t xml:space="preserve"> and </w:t>
+      </w:r>
+      <w:r>
+        <w:rPr>
+          <w:rFonts w:ascii="Times New Roman" w:hAnsi="Times New Roman" w:cs="Times New Roman"/>
+        </w:rPr>
+        <w:t xml:space="preserve">provide </w:t>
+      </w:r>
+      <w:r>
+        <w:rPr>
+          <w:rFonts w:ascii="Times New Roman" w:hAnsi="Times New Roman" w:cs="Times New Roman"/>
+        </w:rPr>
+        <w:t xml:space="preserve">the </w:t>
+      </w:r>
+      <w:r>
+        <w:rPr>
+          <w:rFonts w:ascii="Times New Roman" w:hAnsi="Times New Roman" w:cs="Times New Roman"/>
+        </w:rPr>
+        <w:t xml:space="preserve">CMVP certificate number for the </w:t>
+      </w:r>
+      <w:r>
+        <w:rPr>
+          <w:rFonts w:ascii="Times New Roman" w:hAnsi="Times New Roman" w:cs="Times New Roman"/>
+        </w:rPr>
+        <w:t>item</w:t>
+      </w:r>
+      <w:r>
+        <w:rPr>
+          <w:rFonts w:ascii="Times New Roman" w:hAnsi="Times New Roman" w:cs="Times New Roman"/>
+        </w:rPr>
+        <w:t xml:space="preserve"> as required in the </w:t>
+      </w:r>
+      <w:r>
+        <w:rPr>
+          <w:rFonts w:ascii="Times New Roman" w:hAnsi="Times New Roman" w:cs="Times New Roman"/>
+          <w:i/>
+          <w:iCs/>
+        </w:rPr>
+        <w:t>FRTC test case 7.09.05</w:t>
+      </w:r>
+      <w:r>
+        <w:rPr>
+          <w:rFonts w:ascii="Times New Roman" w:hAnsi="Times New Roman" w:cs="Times New Roman"/>
+        </w:rPr>
+        <w:t>.</w:t>
+      </w:r>
+    </w:p>
+    <w:p>
+      <w:pPr>
+        <w:pStyle w:val="ListParagraph"/>
+        <w:numPr>
+          <w:ilvl w:val="0"/>
+          <w:numId w:val="1"/>
+        </w:numPr>
+        <w:rPr>
+          <w:rFonts w:ascii="Times New Roman" w:hAnsi="Times New Roman" w:cs="Times New Roman"/>
+        </w:rPr>
+      </w:pPr>
+      <w:r>
+        <w:rPr>
+          <w:rFonts w:ascii="Times New Roman" w:hAnsi="Times New Roman" w:cs="Times New Roman"/>
+        </w:rPr>
+        <w:t>Does the solution support SM-Auth</w:t>
+      </w:r>
+      <w:r>
+        <w:rPr>
+          <w:rFonts w:ascii="Times New Roman" w:hAnsi="Times New Roman" w:cs="Times New Roman"/>
+        </w:rPr>
+        <w:t xml:space="preserve"> at the </w:t>
+      </w:r>
+      <w:r>
+        <w:rPr>
+          <w:rFonts w:ascii="Times New Roman" w:hAnsi="Times New Roman" w:cs="Times New Roman"/>
+          <w:i/>
+          <w:iCs/>
+        </w:rPr>
+        <w:t>Time of Access</w:t>
+      </w:r>
+      <w:r>
+        <w:rPr>
+          <w:rFonts w:ascii="Times New Roman" w:hAnsi="Times New Roman" w:cs="Times New Roman"/>
+        </w:rPr>
+        <w:t>?</w:t>
+      </w:r>
+    </w:p>
+    <w:p>
+      <w:pPr>
+        <w:pStyle w:val="ListParagraph"/>
+        <w:numPr>
+          <w:ilvl w:val="1"/>
+          <w:numId w:val="1"/>
+        </w:numPr>
+        <w:rPr>
+          <w:rFonts w:ascii="Times New Roman" w:hAnsi="Times New Roman" w:cs="Times New Roman"/>
+        </w:rPr>
+      </w:pPr>
+      <w:r>
+        <w:rPr>
+          <w:rFonts w:ascii="Times New Roman" w:hAnsi="Times New Roman" w:cs="Times New Roman"/>
+        </w:rPr>
+        <w:t xml:space="preserve">If </w:t>
+      </w:r>
+      <w:r>
+        <w:rPr>
+          <w:rFonts w:ascii="Times New Roman" w:hAnsi="Times New Roman" w:cs="Times New Roman"/>
+          <w:kern w:val="0"/>
+          <w14:ligatures w14:val="none"/>
+        </w:rPr>
+        <w:t xml:space="preserve">so, how can I modify the authentication mode on the reader during </w:t>
+      </w:r>
+      <w:r>
+        <w:rPr>
+          <w:rFonts w:ascii="Times New Roman" w:hAnsi="Times New Roman" w:cs="Times New Roman"/>
+          <w:kern w:val="0"/>
+          <w14:ligatures w14:val="none"/>
+        </w:rPr>
+        <w:t xml:space="preserve">the </w:t>
+      </w:r>
+      <w:r>
+        <w:rPr>
+          <w:rFonts w:ascii="Times New Roman" w:hAnsi="Times New Roman" w:cs="Times New Roman"/>
+          <w:i/>
+          <w:iCs/>
+          <w:kern w:val="0"/>
+          <w14:ligatures w14:val="none"/>
+        </w:rPr>
+        <w:t xml:space="preserve">time of </w:t>
+      </w:r>
+      <w:r>
+        <w:rPr>
+          <w:rFonts w:ascii="Times New Roman" w:hAnsi="Times New Roman" w:cs="Times New Roman"/>
+          <w:i/>
+          <w:iCs/>
+          <w:kern w:val="0"/>
+          <w14:ligatures w14:val="none"/>
+        </w:rPr>
+        <w:t>access</w:t>
+      </w:r>
+      <w:r>
+        <w:rPr>
+          <w:rFonts w:ascii="Times New Roman" w:hAnsi="Times New Roman" w:cs="Times New Roman"/>
+        </w:rPr>
+        <w:t xml:space="preserve"> test cases? </w:t>
+      </w:r>
+    </w:p>
+    <w:p>
+      <w:pPr>
+        <w:pStyle w:val="ListParagraph"/>
+        <w:numPr>
+          <w:ilvl w:val="0"/>
+          <w:numId w:val="1"/>
+        </w:numPr>
+        <w:rPr>
+          <w:rFonts w:ascii="Times New Roman" w:hAnsi="Times New Roman" w:cs="Times New Roman"/>
+        </w:rPr>
+      </w:pPr>
+      <w:r>
+        <w:rPr>
+          <w:rFonts w:ascii="Times New Roman" w:hAnsi="Times New Roman" w:cs="Times New Roman"/>
+        </w:rPr>
+        <w:t>Does the solution support OCC-Auth?</w:t>
       </w:r>
     </w:p>
     <w:sectPr>
@@ -1511,11 +2136,6 @@
         <w:docPartUnique/>
       </w:docPartObj>
     </w:sdtPr>
-    <w:sdtEndPr>
-      <w:rPr>
-        <w:rStyle w:val="PageNumber"/>
-      </w:rPr>
-    </w:sdtEndPr>
     <w:sdtContent>
       <w:p>
         <w:pPr>
@@ -1567,11 +2187,6 @@
         <w:docPartUnique/>
       </w:docPartObj>
     </w:sdtPr>
-    <w:sdtEndPr>
-      <w:rPr>
-        <w:rStyle w:val="PageNumber"/>
-      </w:rPr>
-    </w:sdtEndPr>
     <w:sdtContent>
       <w:p>
         <w:pPr>
@@ -1731,7 +2346,7 @@
         <w:szCs w:val="28"/>
         <w14:ligatures w14:val="none"/>
       </w:rPr>
-      <w:t>2</w:t>
+      <w:t>3</w:t>
     </w:r>
     <w:r>
       <w:rPr>
@@ -1803,7 +2418,43 @@
         <w:szCs w:val="20"/>
         <w14:ligatures w14:val="none"/>
       </w:rPr>
-      <w:t xml:space="preserve"> 2025-05-12</w:t>
+      <w:t xml:space="preserve"> 2025-0</w:t>
+    </w:r>
+    <w:r>
+      <w:rPr>
+        <w:rFonts w:ascii="Times New Roman" w:hAnsi="Times New Roman" w:cs="Times New Roman"/>
+        <w:bCs/>
+        <w:color w:val="2F5496" w:themeColor="accent1" w:themeShade="BF"/>
+        <w:spacing w:val="5"/>
+        <w:sz w:val="20"/>
+        <w:szCs w:val="20"/>
+        <w14:ligatures w14:val="none"/>
+      </w:rPr>
+      <w:t>8</w:t>
+    </w:r>
+    <w:r>
+      <w:rPr>
+        <w:rFonts w:ascii="Times New Roman" w:hAnsi="Times New Roman" w:cs="Times New Roman"/>
+        <w:bCs/>
+        <w:color w:val="2F5496" w:themeColor="accent1" w:themeShade="BF"/>
+        <w:spacing w:val="5"/>
+        <w:sz w:val="20"/>
+        <w:szCs w:val="20"/>
+        <w14:ligatures w14:val="none"/>
+      </w:rPr>
+      <w:t>-</w:t>
+    </w:r>
+    <w:r>
+      <w:rPr>
+        <w:rFonts w:ascii="Times New Roman" w:hAnsi="Times New Roman" w:cs="Times New Roman"/>
+        <w:bCs/>
+        <w:color w:val="2F5496" w:themeColor="accent1" w:themeShade="BF"/>
+        <w:spacing w:val="5"/>
+        <w:sz w:val="20"/>
+        <w:szCs w:val="20"/>
+        <w14:ligatures w14:val="none"/>
+      </w:rPr>
+      <w:t>21</w:t>
     </w:r>
   </w:p>
 </w:hdr>

</xml_diff>